<commit_message>
Update project spec to Foundation v1.4
</commit_message>
<xml_diff>
--- a/docs/specs/Riven_New_Project_Spec_2026-09-24.docx
+++ b/docs/specs/Riven_New_Project_Spec_2026-09-24.docx
@@ -41,7 +41,7 @@
           <w:color w:val="615A68"/>
           <w:sz w:val="19"/>
         </w:rPr>
-        <w:t>FOUNDATION v1.1  |  24 SEP 2026  |  CLEAN-ROOM REBUILD</w:t>
+        <w:t>FOUNDATION v1.4  |  25 SEP 2026  |  CLEAN-ROOM REBUILD</w:t>
       </w:r>
     </w:p>
     <w:tbl>
@@ -1652,7 +1652,7 @@
       </w:pPr>
       <w:r>
         <w:rPr>
-          <w:rFonts w:ascii="Noto Sans" w:hAnsi="Noto Sans"/>
+          <w:rFonts w:ascii="Aptos" w:hAnsi="Aptos"/>
           <w:b/>
           <w:color w:val="7E6884"/>
           <w:sz w:val="17"/>
@@ -1665,7 +1665,26 @@
           <w:color w:val="26242A"/>
           <w:sz w:val="20"/>
         </w:rPr>
-        <w:t>Exact language, UI toolkit, database library, dependency-injection style, and module layout are engineering decisions for the new build. Kotlin/Compose/Room remain plausible defaults, not inherited canon.</w:t>
+      </w:r>
+      <w:r>
+        <w:rPr>
+          <w:rFonts w:ascii="Georgia" w:hAnsi="Georgia"/>
+          <w:color w:val="26242A"/>
+          <w:sz w:val="20"/>
+        </w:rPr>
+        <w:t>Foundation stack is now locked: Kotlin, Jetpack Compose, Room/SQLite, Java 17, minSdk 35, and compile/target API 37. Room 2.8.5 with KSP 2.3.12 is the current persistence toolchain. These are clean-room decisions for this project, not inherited Prototype Riven canon.</w:t>
+      </w:r>
+    </w:p>
+    <w:p>
+      <w:pPr/>
+      <w:r>
+        <w:rPr>
+          <w:rFonts w:ascii="Aptos" w:hAnsi="Aptos"/>
+          <w:b/>
+          <w:color w:val="7E6884"/>
+          <w:sz w:val="17"/>
+        </w:rPr>
+        <w:t>PERSISTENCE FOUNDATION  Room schema v3 is current at 26 tables (identity hash 59982f69933deee14cc34323bba4c4cb). Schemas v1 and v2 remain preserved as historical migration baselines, with explicit non-destructive Migrations 1-&gt;2 and 2-&gt;3. Canonical memory write transactions v1, Conversation Timeline Foundation v1, Safe Delete v1, and Shai System Instructions Foundation v1 are implemented and integrated. Future physical-schema changes must use explicit migrations; destructive migration fallback is not permitted.</w:t>
       </w:r>
     </w:p>
     <w:tbl>
@@ -1855,6 +1874,14 @@
     <w:p>
       <w:pPr>
         <w:pStyle w:val="ListBullet"/>
+      </w:pPr>
+      <w:r>
+        <w:t>Persistent Shai-authored System Instructions, stored separately from transcript and personal memory.</w:t>
+      </w:r>
+    </w:p>
+    <w:p>
+      <w:pPr>
+        <w:pStyle w:val="ListBullet"/>
         <w:spacing w:after="60" w:line="252" w:lineRule="auto"/>
       </w:pPr>
       <w:r>
@@ -1995,7 +2022,212 @@
                 <w:color w:val="FFFFFF"/>
                 <w:sz w:val="22"/>
               </w:rPr>
-              <w:t>5. RIVEN PRESENCE AND AVATAR CONTRACT</w:t>
+              <w:t>5. CHAT INTERACTION BASELINE</w:t>
+            </w:r>
+          </w:p>
+        </w:tc>
+      </w:tr>
+    </w:tbl>
+    <w:p>
+      <w:pPr/>
+      <w:r>
+        <w:t>These controls are required product behavior, not later polish. Their semantics are now locked in this specification. Rewind/regenerate, active/inactive branch semantics, Safe Delete propagation, and persistent Shai System Instructions are implemented. First-class image/selfie attachment storage and media provenance remain required integration work before automatic memory extraction.</w:t>
+      </w:r>
+    </w:p>
+    <w:p>
+      <w:pPr>
+        <w:pStyle w:val="Heading2"/>
+      </w:pPr>
+      <w:r>
+        <w:t>Delete, rewind, and regenerate</w:t>
+      </w:r>
+    </w:p>
+    <w:p>
+      <w:pPr>
+        <w:pStyle w:val="ListBullet"/>
+      </w:pPr>
+      <w:r>
+        <w:t>Delete is implemented through Safe Delete v1. The current physical transcript primitive deletes leaf turns only; non-leaf causal ancestors are refused rather than silently reparented. Active-head deletion moves the head to its parent, off-path leaf deletion preserves the active branch, and every successful transcript deletion increments timeline_revision. Source Experiences, Candidate evidence, Memory evidence, Open Loops, audits, relationships, and derived artifacts are deleted, repaired, invalidated, or conservatively refused as provenance requires. Transcript deletion remains distinct from Memory Forget and Memory Delete. Whole-conversation deletion may later compose these same dependency rules.</w:t>
+      </w:r>
+    </w:p>
+    <w:p>
+      <w:pPr>
+        <w:pStyle w:val="ListBullet"/>
+      </w:pPr>
+      <w:r>
+        <w:t>Rewind moves the active conversation head to a chosen earlier point. Content after that point becomes an abandoned branch and must be excluded from active prompt context, ordinary retrieval, candidate extraction, reinforcement, and relationship-state evolution. If abandoned content is retained for undo, debugging, or branch history, it must be explicitly inactive and cognitively invisible unless deliberately restored.</w:t>
+      </w:r>
+    </w:p>
+    <w:p>
+      <w:pPr>
+        <w:pStyle w:val="ListBullet"/>
+      </w:pPr>
+      <w:r>
+        <w:t>Regenerate creates an alternate Riven response to the same preceding context. Only the selected active response participates in the continuing transcript and future memory processing. Discarded generations must never become autobiographical evidence merely because a model produced them.</w:t>
+      </w:r>
+    </w:p>
+    <w:p>
+      <w:pPr>
+        <w:pStyle w:val="ListBullet"/>
+      </w:pPr>
+      <w:r>
+        <w:t>Conversation Timeline Foundation v1 is implemented in Room schema v2: message_parent_edges preserve immutable parentage, conversation_timeline_heads stores one active head plus timeline_revision, and the active path is reconstructed by walking parents from the head. sequence_number remains creation order. Rewind moves the head while retaining the old suffix off-path; Regenerate creates a sibling assistant response from the same preceding context; stale timeline revisions reject writes against an abandoned branch.</w:t>
+      </w:r>
+    </w:p>
+    <w:p>
+      <w:pPr>
+        <w:pStyle w:val="ListBullet"/>
+      </w:pPr>
+      <w:r>
+        <w:t>Migration 1-&gt;2 backfills existing linear transcripts into parent edges and active-head state while preserving v1 canonical rows. Off-path content remains stored as branch history but is excluded from canonical context and future cognitive processing unless deliberately restored.</w:t>
+      </w:r>
+    </w:p>
+    <w:p>
+      <w:pPr/>
+      <w:r>
+        <w:t>Safe Delete v1 is integrated with the timeline and memory foundations. Hard Memory deletion uses opaque DELETE suppression tombstones for retained historical lineage, invalidates full retained source-lineage artifacts, removes canonical Memory meaning, and queues provenance repair without turning tombstones into a shadow memory store. Transcript deletion performs atomic dependency planning first and refuses ambiguous provenance or irreversible Open Loop rollback rather than guessing.</w:t>
+      </w:r>
+    </w:p>
+    <w:p>
+      <w:pPr>
+        <w:pStyle w:val="Heading2"/>
+      </w:pPr>
+      <w:r>
+        <w:t>User-authored System Instructions</w:t>
+      </w:r>
+    </w:p>
+    <w:p>
+      <w:pPr>
+        <w:pStyle w:val="ListBullet"/>
+      </w:pPr>
+      <w:r>
+        <w:t>Provide a dedicated persistent, editable place for Shai to write System Instructions that feed directly into Riven's primary context assembly on future turns. System Instructions Foundation v1 stores one canonical local instruction record with exact content, explicit enabled state, monotonically increasing revision, and created/updated timestamps.</w:t>
+      </w:r>
+    </w:p>
+    <w:p>
+      <w:pPr>
+        <w:pStyle w:val="ListBullet"/>
+      </w:pPr>
+      <w:r>
+        <w:t>System Instructions are a control/context layer, not transcript content and not personal memory merely because they exist. They remain separately inspectable and editable. Context precedence is: app invariants / safety / tool truth; locked Riven personality and identity canon; Shai System Instructions; retrieved dynamic Memory / Open Loops / tool context; active canonical conversation and current interaction.</w:t>
+      </w:r>
+    </w:p>
+    <w:p>
+      <w:pPr>
+        <w:pStyle w:val="ListBullet"/>
+      </w:pPr>
+      <w:r>
+        <w:t>Changing System Instructions affects future model requests without silently rewriting historical conversation or creating fake memory provenance. Writes use optimistic revision checks; stale writes and revision overflow are rejected atomically. Clear removes the old instruction text from canonical storage without keeping a hidden revision archive. Reading, saving, disabling, re-enabling, or clearing System Instructions does not create Messages, Experiences, Candidate Memories, Memories, Open Loops, suppression tombstones, or repair jobs.</w:t>
+      </w:r>
+    </w:p>
+    <w:p>
+      <w:pPr>
+        <w:pStyle w:val="Heading2"/>
+      </w:pPr>
+      <w:r>
+        <w:t>Images and selfie-style media</w:t>
+      </w:r>
+    </w:p>
+    <w:p>
+      <w:pPr>
+        <w:pStyle w:val="ListBullet"/>
+      </w:pPr>
+      <w:r>
+        <w:t>Shai can send images as first-class message attachments. Attachment identity, message association, ordering, and relaunch restoration must survive locally; a provider-neutral multimodal boundary decides how an active model receives them.</w:t>
+      </w:r>
+    </w:p>
+    <w:p>
+      <w:pPr>
+        <w:pStyle w:val="ListBullet"/>
+      </w:pPr>
+      <w:r>
+        <w:t>Riven can send generated selfie-style images as chat media when an image-generation capability is available. The Appearance Canon is the visual authority. Generated images are app/media artifacts, not proof of a physical camera event, and Riven must not claim camera access or real-world capture the app did not perform.</w:t>
+      </w:r>
+    </w:p>
+    <w:p>
+      <w:pPr>
+        <w:pStyle w:val="ListBullet"/>
+      </w:pPr>
+      <w:r>
+        <w:t>Image or selfie generation failure must never block text chat, corrupt transcript history, or alter canonical appearance.</w:t>
+      </w:r>
+    </w:p>
+    <w:p>
+      <w:pPr/>
+      <w:r>
+        <w:t>A new Riven-specific LoRA may be trained for selfie-style generation during the visual-design phase. Prototype LoRA assets do not migrate automatically. The LoRA is an implementation asset rather than canon; the Appearance Canon remains authoritative, and LoRA training/testing may proceed in parallel with UI and media work without blocking the plumbing milestones.</w:t>
+      </w:r>
+    </w:p>
+    <w:p>
+      <w:pPr>
+        <w:pStyle w:val="Heading2"/>
+      </w:pPr>
+      <w:r>
+        <w:t>Deferred modalities</w:t>
+      </w:r>
+    </w:p>
+    <w:p>
+      <w:pPr>
+        <w:pStyle w:val="ListBullet"/>
+      </w:pPr>
+      <w:r>
+        <w:t>Voice chat and video chat are not required for the current foundation or first production milestone. Text plus images are the current multimodal target.</w:t>
+      </w:r>
+    </w:p>
+    <w:p>
+      <w:pPr>
+        <w:pStyle w:val="ListBullet"/>
+      </w:pPr>
+      <w:r>
+        <w:t>ElevenLabs is not selected for integration at this stage. Voice/TTS remains provider-neutral and deferred until consistency and quality justify the engineering cost.</w:t>
+      </w:r>
+    </w:p>
+    <w:tbl>
+      <w:tblPr>
+        <w:tblW w:type="auto" w:w="0"/>
+        <w:jc w:val="center"/>
+        <w:tblLayout w:type="autofit"/>
+        <w:tblLook w:firstColumn="1" w:firstRow="1" w:lastColumn="0" w:lastRow="0" w:noHBand="0" w:noVBand="1" w:val="04A0"/>
+        <w:tblBorders>
+          <w:top w:val="nil"/>
+          <w:left w:val="nil"/>
+          <w:bottom w:val="nil"/>
+          <w:right w:val="nil"/>
+          <w:insideH w:val="nil"/>
+          <w:insideV w:val="nil"/>
+        </w:tblBorders>
+      </w:tblPr>
+      <w:tblGrid>
+        <w:gridCol w:w="10080"/>
+      </w:tblGrid>
+      <w:tr>
+        <w:trPr>
+          <w:cantSplit/>
+        </w:trPr>
+        <w:tc>
+          <w:tcPr>
+            <w:tcW w:type="dxa" w:w="10080"/>
+            <w:shd w:fill="7E6884"/>
+            <w:tcMar>
+              <w:top w:w="80" w:type="dxa"/>
+              <w:start w:w="110" w:type="dxa"/>
+              <w:bottom w:w="80" w:type="dxa"/>
+              <w:end w:w="110" w:type="dxa"/>
+            </w:tcMar>
+          </w:tcPr>
+          <w:p>
+            <w:pPr>
+              <w:keepNext/>
+              <w:spacing w:after="0"/>
+            </w:pPr>
+            <w:r>
+              <w:rPr>
+                <w:rFonts w:ascii="Noto Sans" w:hAnsi="Noto Sans"/>
+                <w:b/>
+                <w:color w:val="FFFFFF"/>
+                <w:sz w:val="22"/>
+              </w:rPr>
+              <w:t>6. RIVEN PRESENCE AND AVATAR CONTRACT</w:t>
             </w:r>
           </w:p>
         </w:tc>
@@ -2546,7 +2778,7 @@
                 <w:color w:val="FFFFFF"/>
                 <w:sz w:val="22"/>
               </w:rPr>
-              <w:t>6. PERSISTENT MEMORY PRODUCT CONTRACT</w:t>
+              <w:t>7. PERSISTENT MEMORY PRODUCT CONTRACT</w:t>
             </w:r>
           </w:p>
         </w:tc>
@@ -2972,6 +3204,30 @@
     <w:p>
       <w:pPr>
         <w:pStyle w:val="ListBullet"/>
+      </w:pPr>
+      <w:r>
+        <w:t>Only active conversation-branch content is eligible as ordinary memory evidence. Deleted turns, abandoned rewind branches, and unselected regenerated responses must not silently seed or reinforce memory.</w:t>
+      </w:r>
+    </w:p>
+    <w:p>
+      <w:pPr>
+        <w:pStyle w:val="ListBullet"/>
+      </w:pPr>
+      <w:r>
+        <w:t>Persistent System Instructions are control context, not personal memory merely because they exist.</w:t>
+      </w:r>
+    </w:p>
+    <w:p>
+      <w:pPr>
+        <w:pStyle w:val="ListBullet"/>
+      </w:pPr>
+      <w:r>
+        <w:t>Memories derived from image interactions must retain provenance back to the relevant message attachment and must not claim visual details the image did not establish.</w:t>
+      </w:r>
+    </w:p>
+    <w:p>
+      <w:pPr>
+        <w:pStyle w:val="ListBullet"/>
         <w:spacing w:after="60" w:line="252" w:lineRule="auto"/>
       </w:pPr>
       <w:r>
@@ -3140,7 +3396,7 @@
                 <w:color w:val="FFFFFF"/>
                 <w:sz w:val="22"/>
               </w:rPr>
-              <w:t>7. RIVEN KNOWLEDGE AND SPECIAL-INTEREST GROUNDING</w:t>
+              <w:t>8. RIVEN KNOWLEDGE AND SPECIAL-INTEREST GROUNDING</w:t>
             </w:r>
           </w:p>
         </w:tc>
@@ -3266,7 +3522,7 @@
                 <w:color w:val="FFFFFF"/>
                 <w:sz w:val="22"/>
               </w:rPr>
-              <w:t>8. INTERNAL TOOL AND ACTION SYSTEM</w:t>
+              <w:t>9. INTERNAL TOOL AND ACTION SYSTEM</w:t>
             </w:r>
           </w:p>
         </w:tc>
@@ -3423,10 +3679,6 @@
             </w:tcMar>
           </w:tcPr>
           <w:p>
-            <w:pPr>
-              <w:keepNext/>
-              <w:spacing w:after="0"/>
-            </w:pPr>
             <w:r>
               <w:rPr>
                 <w:rFonts w:ascii="Noto Sans" w:hAnsi="Noto Sans"/>
@@ -3434,199 +3686,70 @@
                 <w:color w:val="FFFFFF"/>
                 <w:sz w:val="22"/>
               </w:rPr>
-              <w:t>9. NOTIFICATIONS, REMINDERS, CALENDAR, AND TRACKERS</w:t>
+              <w:t>10. LOCAL ARCADE V1</w:t>
             </w:r>
           </w:p>
         </w:tc>
       </w:tr>
     </w:tbl>
     <w:p>
-      <w:pPr>
-        <w:spacing w:after="20"/>
-      </w:pPr>
-    </w:p>
-    <w:p>
-      <w:pPr>
-        <w:keepNext w:val="0"/>
-        <w:spacing w:before="0" w:after="100" w:line="259" w:lineRule="auto"/>
-      </w:pPr>
+      <w:pPr/>
       <w:r>
-        <w:rPr>
-          <w:rFonts w:ascii="Noto Serif" w:hAnsi="Noto Serif"/>
-          <w:color w:val="26242A"/>
-          <w:sz w:val="20"/>
-        </w:rPr>
-        <w:t>These features survive the rebuild because they reduce remembering overhead and give Riven useful real context. They are companion utilities, not a mandate for constant supervision.</w:t>
+        <w:t>Riven may include a small local arcade for low-pressure decompression and repetitive play. Arcade features are companion utilities, not monetized engagement systems.</w:t>
       </w:r>
     </w:p>
     <w:p>
       <w:pPr>
         <w:pStyle w:val="Heading2"/>
-        <w:keepNext/>
-        <w:spacing w:before="0" w:after="100" w:line="259" w:lineRule="auto"/>
       </w:pPr>
       <w:r>
-        <w:rPr>
-          <w:rFonts w:ascii="Noto Serif" w:hAnsi="Noto Serif"/>
-          <w:color w:val="26242A"/>
-          <w:sz w:val="20"/>
-        </w:rPr>
-        <w:t>Notifications and reminders</w:t>
+        <w:t>Stacker</w:t>
       </w:r>
     </w:p>
     <w:p>
-      <w:pPr>
-        <w:pStyle w:val="ListBullet"/>
-        <w:spacing w:after="60" w:line="252" w:lineRule="auto"/>
-      </w:pPr>
+      <w:pPr/>
       <w:r>
-        <w:rPr>
-          <w:rFonts w:ascii="Noto Serif" w:hAnsi="Noto Serif"/>
-          <w:color w:val="26242A"/>
-          <w:sz w:val="20"/>
-        </w:rPr>
-        <w:t>Android notifications that can persist outside the open chat screen.</w:t>
+        <w:t>Stacker is an original endless falling-block, line-clearing game inspired by the broad puzzle genre without copying proprietary branding, art, music, or product identity. It should support score, lines cleared, personal best, pause, restart, and a Chill mode that caps speed at a comfortable ceiling instead of escalating indefinitely.</w:t>
       </w:r>
     </w:p>
     <w:p>
       <w:pPr>
-        <w:pStyle w:val="ListBullet"/>
-        <w:spacing w:after="60" w:line="252" w:lineRule="auto"/>
+        <w:pStyle w:val="Heading2"/>
       </w:pPr>
       <w:r>
-        <w:rPr>
-          <w:rFonts w:ascii="Noto Serif" w:hAnsi="Noto Serif"/>
-          <w:color w:val="26242A"/>
-          <w:sz w:val="20"/>
-        </w:rPr>
-        <w:t>Per-feature enable/disable controls, quiet hours, snooze, and user-controlled cadence.</w:t>
+        <w:t>Klondike Solitaire</w:t>
       </w:r>
     </w:p>
     <w:p>
-      <w:pPr>
-        <w:pStyle w:val="ListBullet"/>
-        <w:spacing w:after="60" w:line="252" w:lineRule="auto"/>
-      </w:pPr>
+      <w:pPr/>
       <w:r>
-        <w:rPr>
-          <w:rFonts w:ascii="Noto Serif" w:hAnsi="Noto Serif"/>
-          <w:color w:val="26242A"/>
-          <w:sz w:val="20"/>
-        </w:rPr>
-        <w:t>No repeated nagging after deliberate dismissal or skip unless the user has explicitly configured escalation.</w:t>
+        <w:t>Solitaire v1 is classic single-player Klondike, with draw-one as the default ruleset unless later design testing chooses otherwise. Required basics are tap/click-friendly play, drag support where useful, undo, restart/new deal, win detection, and optional elapsed-time / move counts without pressure or monetized hints.</w:t>
       </w:r>
     </w:p>
     <w:p>
       <w:pPr>
-        <w:pStyle w:val="ListBullet"/>
-        <w:spacing w:after="60" w:line="252" w:lineRule="auto"/>
+        <w:pStyle w:val="Heading2"/>
       </w:pPr>
       <w:r>
-        <w:rPr>
-          <w:rFonts w:ascii="Noto Serif" w:hAnsi="Noto Serif"/>
-          <w:color w:val="26242A"/>
-          <w:sz w:val="20"/>
-        </w:rPr>
-        <w:t>Create, edit, complete, snooze, and cancel reminders.</w:t>
+        <w:t>Arcade data and Riven awareness</w:t>
       </w:r>
     </w:p>
     <w:p>
-      <w:pPr>
-        <w:pStyle w:val="ListBullet"/>
-        <w:spacing w:after="60" w:line="252" w:lineRule="auto"/>
-      </w:pPr>
+      <w:pPr/>
       <w:r>
-        <w:rPr>
-          <w:rFonts w:ascii="Noto Serif" w:hAnsi="Noto Serif"/>
-          <w:color w:val="26242A"/>
-          <w:sz w:val="20"/>
-        </w:rPr>
-        <w:t>Scheduled items must be represented clearly enough that Riven can refer to them truthfully.</w:t>
+        <w:t>Both games must work fully offline and contain no ads, in-app purchases, paid hints, currencies, energy systems, loot boxes, power-ups, external leaderboards, required accounts, or required network access. Persistent game data should be minimal and local, such as personal bests and small per-game preferences/state.</w:t>
       </w:r>
     </w:p>
     <w:p>
-      <w:pPr>
-        <w:pStyle w:val="ListBullet"/>
-        <w:spacing w:after="60" w:line="252" w:lineRule="auto"/>
-      </w:pPr>
+      <w:pPr/>
       <w:r>
-        <w:rPr>
-          <w:rFonts w:ascii="Noto Serif" w:hAnsi="Noto Serif"/>
-          <w:color w:val="26242A"/>
-          <w:sz w:val="20"/>
-        </w:rPr>
-        <w:t>Calendar/upcoming items may surface naturally when relevant, without turning ordinary conversation into a task review.</w:t>
+        <w:t>Ordinary gameplay telemetry and scores are not Memory evidence by default. A future provider-neutral ARCADE_STATE may expose bounded live context such as active game, score / lines / moves, game-over state, and personal-best events so Riven can react naturally. This is ephemeral operational context unless conversation or another explicit memory process gives it autobiographical significance.</w:t>
       </w:r>
     </w:p>
     <w:p>
-      <w:pPr>
-        <w:pStyle w:val="Heading2"/>
-        <w:keepNext/>
-        <w:spacing w:before="0" w:after="100" w:line="259" w:lineRule="auto"/>
-      </w:pPr>
+      <w:pPr/>
       <w:r>
-        <w:rPr>
-          <w:rFonts w:ascii="Noto Serif" w:hAnsi="Noto Serif"/>
-          <w:color w:val="26242A"/>
-          <w:sz w:val="20"/>
-        </w:rPr>
-        <w:t>Personal trackers</w:t>
-      </w:r>
-    </w:p>
-    <w:p>
-      <w:pPr>
-        <w:pStyle w:val="ListBullet"/>
-        <w:spacing w:after="60" w:line="252" w:lineRule="auto"/>
-      </w:pPr>
-      <w:r>
-        <w:rPr>
-          <w:rFonts w:ascii="Noto Serif" w:hAnsi="Noto Serif"/>
-          <w:color w:val="26242A"/>
-          <w:sz w:val="20"/>
-        </w:rPr>
-        <w:t>Mood: low-friction check-in, optional context note, history, and pattern review.</w:t>
-      </w:r>
-    </w:p>
-    <w:p>
-      <w:pPr>
-        <w:pStyle w:val="ListBullet"/>
-        <w:spacing w:after="60" w:line="252" w:lineRule="auto"/>
-      </w:pPr>
-      <w:r>
-        <w:rPr>
-          <w:rFonts w:ascii="Noto Serif" w:hAnsi="Noto Serif"/>
-          <w:color w:val="26242A"/>
-          <w:sz w:val="20"/>
-        </w:rPr>
-        <w:t>Medication: schedule, reminders, taken/skipped/snoozed state, history, and pattern review. No prescribing, dosage changes, shaming, or claims of medical authority.</w:t>
-      </w:r>
-    </w:p>
-    <w:p>
-      <w:pPr>
-        <w:pStyle w:val="ListBullet"/>
-        <w:spacing w:after="60" w:line="252" w:lineRule="auto"/>
-      </w:pPr>
-      <w:r>
-        <w:rPr>
-          <w:rFonts w:ascii="Noto Serif" w:hAnsi="Noto Serif"/>
-          <w:color w:val="26242A"/>
-          <w:sz w:val="20"/>
-        </w:rPr>
-        <w:t>Cycle/period: dates, optional symptoms/notes, history, and simple date-based predictions once enough data exists.</w:t>
-      </w:r>
-    </w:p>
-    <w:p>
-      <w:pPr>
-        <w:pStyle w:val="ListBullet"/>
-        <w:spacing w:after="60" w:line="252" w:lineRule="auto"/>
-      </w:pPr>
-      <w:r>
-        <w:rPr>
-          <w:rFonts w:ascii="Noto Serif" w:hAnsi="Noto Serif"/>
-          <w:color w:val="26242A"/>
-          <w:sz w:val="20"/>
-        </w:rPr>
-        <w:t>Tracker context may inform conversation when relevant but must not permanently define Shai's current state or swallow Riven's personality.</w:t>
+        <w:t>Arcade failure must never block chat, memory, provider calls, or core app startup. Arcade v1 belongs to the Visual/UI phase after the remaining plumbing is stable.</w:t>
       </w:r>
     </w:p>
     <w:tbl>
@@ -3663,10 +3786,6 @@
             </w:tcMar>
           </w:tcPr>
           <w:p>
-            <w:pPr>
-              <w:keepNext/>
-              <w:spacing w:after="0"/>
-            </w:pPr>
             <w:r>
               <w:rPr>
                 <w:rFonts w:ascii="Noto Sans" w:hAnsi="Noto Sans"/>
@@ -3674,7 +3793,7 @@
                 <w:color w:val="FFFFFF"/>
                 <w:sz w:val="22"/>
               </w:rPr>
-              <w:t>10. PRIVACY, SECURITY, AND TRUTHFULNESS</w:t>
+              <w:t>11. NOTIFICATIONS, REMINDERS, CALENDAR, AND TRACKERS</w:t>
             </w:r>
           </w:p>
         </w:tc>
@@ -3687,8 +3806,8 @@
     </w:p>
     <w:p>
       <w:pPr>
-        <w:pStyle w:val="ListBullet"/>
-        <w:spacing w:after="60" w:line="252" w:lineRule="auto"/>
+        <w:keepNext w:val="0"/>
+        <w:spacing w:before="0" w:after="100" w:line="259" w:lineRule="auto"/>
       </w:pPr>
       <w:r>
         <w:rPr>
@@ -3696,13 +3815,14 @@
           <w:color w:val="26242A"/>
           <w:sz w:val="20"/>
         </w:rPr>
-        <w:t>No analytics by default.</w:t>
+        <w:t>These features survive the rebuild because they reduce remembering overhead and give Riven useful real context. They are companion utilities, not a mandate for constant supervision.</w:t>
       </w:r>
     </w:p>
     <w:p>
       <w:pPr>
-        <w:pStyle w:val="ListBullet"/>
-        <w:spacing w:after="60" w:line="252" w:lineRule="auto"/>
+        <w:pStyle w:val="Heading2"/>
+        <w:keepNext/>
+        <w:spacing w:before="0" w:after="100" w:line="259" w:lineRule="auto"/>
       </w:pPr>
       <w:r>
         <w:rPr>
@@ -3710,7 +3830,7 @@
           <w:color w:val="26242A"/>
           <w:sz w:val="20"/>
         </w:rPr>
-        <w:t>Conversation and personal-life data remain local-first and app-private.</w:t>
+        <w:t>Notifications and reminders</w:t>
       </w:r>
     </w:p>
     <w:p>
@@ -3724,7 +3844,7 @@
           <w:color w:val="26242A"/>
           <w:sz w:val="20"/>
         </w:rPr>
-        <w:t>No silent cloud backup, upload, or transfer of intimate data without deliberate user choice.</w:t>
+        <w:t>Android notifications that can persist outside the open chat screen.</w:t>
       </w:r>
     </w:p>
     <w:p>
@@ -3738,7 +3858,7 @@
           <w:color w:val="26242A"/>
           <w:sz w:val="20"/>
         </w:rPr>
-        <w:t>Debug logging must avoid retaining intimate transcript text unless deliberately enabled for a specific troubleshooting purpose.</w:t>
+        <w:t>Per-feature enable/disable controls, quiet hours, snooze, and user-controlled cadence.</w:t>
       </w:r>
     </w:p>
     <w:p>
@@ -3752,7 +3872,7 @@
           <w:color w:val="26242A"/>
           <w:sz w:val="20"/>
         </w:rPr>
-        <w:t>Sensitive memory and tracker data use conservative access controls.</w:t>
+        <w:t>No repeated nagging after deliberate dismissal or skip unless the user has explicitly configured escalation.</w:t>
       </w:r>
     </w:p>
     <w:p>
@@ -3766,7 +3886,7 @@
           <w:color w:val="26242A"/>
           <w:sz w:val="20"/>
         </w:rPr>
-        <w:t>System knowledge, character knowledge, user-provided information, and real tool results must remain distinguishable.</w:t>
+        <w:t>Create, edit, complete, snooze, and cancel reminders.</w:t>
       </w:r>
     </w:p>
     <w:p>
@@ -3780,7 +3900,92 @@
           <w:color w:val="26242A"/>
           <w:sz w:val="20"/>
         </w:rPr>
-        <w:t>Riven must never claim an external action, observation, memory, or capability that the app cannot substantiate.</w:t>
+        <w:t>Scheduled items must be represented clearly enough that Riven can refer to them truthfully.</w:t>
+      </w:r>
+    </w:p>
+    <w:p>
+      <w:pPr>
+        <w:pStyle w:val="ListBullet"/>
+        <w:spacing w:after="60" w:line="252" w:lineRule="auto"/>
+      </w:pPr>
+      <w:r>
+        <w:rPr>
+          <w:rFonts w:ascii="Noto Serif" w:hAnsi="Noto Serif"/>
+          <w:color w:val="26242A"/>
+          <w:sz w:val="20"/>
+        </w:rPr>
+        <w:t>Calendar/upcoming items may surface naturally when relevant, without turning ordinary conversation into a task review.</w:t>
+      </w:r>
+    </w:p>
+    <w:p>
+      <w:pPr>
+        <w:pStyle w:val="Heading2"/>
+        <w:keepNext/>
+        <w:spacing w:before="0" w:after="100" w:line="259" w:lineRule="auto"/>
+      </w:pPr>
+      <w:r>
+        <w:rPr>
+          <w:rFonts w:ascii="Noto Serif" w:hAnsi="Noto Serif"/>
+          <w:color w:val="26242A"/>
+          <w:sz w:val="20"/>
+        </w:rPr>
+        <w:t>Personal trackers</w:t>
+      </w:r>
+    </w:p>
+    <w:p>
+      <w:pPr>
+        <w:pStyle w:val="ListBullet"/>
+        <w:spacing w:after="60" w:line="252" w:lineRule="auto"/>
+      </w:pPr>
+      <w:r>
+        <w:rPr>
+          <w:rFonts w:ascii="Noto Serif" w:hAnsi="Noto Serif"/>
+          <w:color w:val="26242A"/>
+          <w:sz w:val="20"/>
+        </w:rPr>
+        <w:t>Mood: low-friction check-in, optional context note, history, and pattern review.</w:t>
+      </w:r>
+    </w:p>
+    <w:p>
+      <w:pPr>
+        <w:pStyle w:val="ListBullet"/>
+        <w:spacing w:after="60" w:line="252" w:lineRule="auto"/>
+      </w:pPr>
+      <w:r>
+        <w:rPr>
+          <w:rFonts w:ascii="Noto Serif" w:hAnsi="Noto Serif"/>
+          <w:color w:val="26242A"/>
+          <w:sz w:val="20"/>
+        </w:rPr>
+        <w:t>Medication: schedule, reminders, taken/skipped/snoozed state, history, and pattern review. No prescribing, dosage changes, shaming, or claims of medical authority.</w:t>
+      </w:r>
+    </w:p>
+    <w:p>
+      <w:pPr>
+        <w:pStyle w:val="ListBullet"/>
+        <w:spacing w:after="60" w:line="252" w:lineRule="auto"/>
+      </w:pPr>
+      <w:r>
+        <w:rPr>
+          <w:rFonts w:ascii="Noto Serif" w:hAnsi="Noto Serif"/>
+          <w:color w:val="26242A"/>
+          <w:sz w:val="20"/>
+        </w:rPr>
+        <w:t>Cycle/period: dates, optional symptoms/notes, history, and simple date-based predictions once enough data exists.</w:t>
+      </w:r>
+    </w:p>
+    <w:p>
+      <w:pPr>
+        <w:pStyle w:val="ListBullet"/>
+        <w:spacing w:after="60" w:line="252" w:lineRule="auto"/>
+      </w:pPr>
+      <w:r>
+        <w:rPr>
+          <w:rFonts w:ascii="Noto Serif" w:hAnsi="Noto Serif"/>
+          <w:color w:val="26242A"/>
+          <w:sz w:val="20"/>
+        </w:rPr>
+        <w:t>Tracker context may inform conversation when relevant but must not permanently define Shai's current state or swallow Riven's personality.</w:t>
       </w:r>
     </w:p>
     <w:tbl>
@@ -3817,10 +4022,6 @@
             </w:tcMar>
           </w:tcPr>
           <w:p>
-            <w:pPr>
-              <w:keepNext/>
-              <w:spacing w:after="0"/>
-            </w:pPr>
             <w:r>
               <w:rPr>
                 <w:rFonts w:ascii="Noto Sans" w:hAnsi="Noto Sans"/>
@@ -3828,7 +4029,7 @@
                 <w:color w:val="FFFFFF"/>
                 <w:sz w:val="22"/>
               </w:rPr>
-              <w:t>11. INTENTIONALLY OPEN DESIGN DECISIONS</w:t>
+              <w:t>12. PRIVACY, SECURITY, AND TRUTHFULNESS</w:t>
             </w:r>
           </w:p>
         </w:tc>
@@ -3841,8 +4042,8 @@
     </w:p>
     <w:p>
       <w:pPr>
-        <w:keepNext w:val="0"/>
-        <w:spacing w:before="0" w:after="100" w:line="259" w:lineRule="auto"/>
+        <w:pStyle w:val="ListBullet"/>
+        <w:spacing w:after="60" w:line="252" w:lineRule="auto"/>
       </w:pPr>
       <w:r>
         <w:rPr>
@@ -3850,7 +4051,15 @@
           <w:color w:val="26242A"/>
           <w:sz w:val="20"/>
         </w:rPr>
-        <w:t>The rebuild does not inherit an answer to these questions. They get dedicated design passes rather than accidental defaults.</w:t>
+        <w:t>No analytics by default.</w:t>
+      </w:r>
+    </w:p>
+    <w:p>
+      <w:pPr>
+        <w:pStyle w:val="ListBullet"/>
+      </w:pPr>
+      <w:r>
+        <w:t>Arcade scores, personal bests, preferences, and resumable game state remain local and are not sent to analytics or external leaderboards.</w:t>
       </w:r>
     </w:p>
     <w:p>
@@ -3864,7 +4073,15 @@
           <w:color w:val="26242A"/>
           <w:sz w:val="20"/>
         </w:rPr>
-        <w:t>Theme, palette, environment concept, visual language, and screen composition.</w:t>
+        <w:t>Conversation and personal-life data remain local-first and app-private.</w:t>
+      </w:r>
+    </w:p>
+    <w:p>
+      <w:pPr>
+        <w:pStyle w:val="ListBullet"/>
+      </w:pPr>
+      <w:r>
+        <w:t>User-sent images and generated selfie/media artifacts remain local-first. Transmit user media only when the active requested model or capability requires it, and never as a silent background upload.</w:t>
       </w:r>
     </w:p>
     <w:p>
@@ -3878,7 +4095,7 @@
           <w:color w:val="26242A"/>
           <w:sz w:val="20"/>
         </w:rPr>
-        <w:t>Main chat layout and how much of Riven is physically visible at different screen sizes.</w:t>
+        <w:t>No silent cloud backup, upload, or transfer of intimate data without deliberate user choice.</w:t>
       </w:r>
     </w:p>
     <w:p>
@@ -3892,7 +4109,7 @@
           <w:color w:val="26242A"/>
           <w:sz w:val="20"/>
         </w:rPr>
-        <w:t>Full-body vs waist-up vs portrait asset roles.</w:t>
+        <w:t>Debug logging must avoid retaining intimate transcript text unless deliberately enabled for a specific troubleshooting purpose.</w:t>
       </w:r>
     </w:p>
     <w:p>
@@ -3906,7 +4123,7 @@
           <w:color w:val="26242A"/>
           <w:sz w:val="20"/>
         </w:rPr>
-        <w:t>Wardrobe system, unlocked body-design details, tattoos, piercings, and other visual canon not yet fixed by the Appearance Sheet.</w:t>
+        <w:t>Sensitive memory and tracker data use conservative access controls.</w:t>
       </w:r>
     </w:p>
     <w:p>
@@ -3920,7 +4137,7 @@
           <w:color w:val="26242A"/>
           <w:sz w:val="20"/>
         </w:rPr>
-        <w:t>Final sprite count, expression granularity, transitions, and animation policy.</w:t>
+        <w:t>System knowledge, character knowledge, user-provided information, and real tool results must remain distinguishable.</w:t>
       </w:r>
     </w:p>
     <w:p>
@@ -3934,35 +4151,7 @@
           <w:color w:val="26242A"/>
           <w:sz w:val="20"/>
         </w:rPr>
-        <w:t>Voice casting / TTS provider and whether voice is included in the first production milestone.</w:t>
-      </w:r>
-    </w:p>
-    <w:p>
-      <w:pPr>
-        <w:pStyle w:val="ListBullet"/>
-        <w:spacing w:after="60" w:line="252" w:lineRule="auto"/>
-      </w:pPr>
-      <w:r>
-        <w:rPr>
-          <w:rFonts w:ascii="Noto Serif" w:hAnsi="Noto Serif"/>
-          <w:color w:val="26242A"/>
-          <w:sz w:val="20"/>
-        </w:rPr>
-        <w:t>Theme music, ambient audio, or any legacy audio asset.</w:t>
-      </w:r>
-    </w:p>
-    <w:p>
-      <w:pPr>
-        <w:pStyle w:val="ListBullet"/>
-        <w:spacing w:after="60" w:line="252" w:lineRule="auto"/>
-      </w:pPr>
-      <w:r>
-        <w:rPr>
-          <w:rFonts w:ascii="Noto Serif" w:hAnsi="Noto Serif"/>
-          <w:color w:val="26242A"/>
-          <w:sz w:val="20"/>
-        </w:rPr>
-        <w:t>Exact Android stack, database schema, repository pattern, dependency injection, module structure, and notification internals.</w:t>
+        <w:t>Riven must never claim an external action, observation, memory, or capability that the app cannot substantiate.</w:t>
       </w:r>
     </w:p>
     <w:tbl>
@@ -3999,10 +4188,6 @@
             </w:tcMar>
           </w:tcPr>
           <w:p>
-            <w:pPr>
-              <w:keepNext/>
-              <w:spacing w:after="0"/>
-            </w:pPr>
             <w:r>
               <w:rPr>
                 <w:rFonts w:ascii="Noto Sans" w:hAnsi="Noto Sans"/>
@@ -4010,7 +4195,7 @@
                 <w:color w:val="FFFFFF"/>
                 <w:sz w:val="22"/>
               </w:rPr>
-              <w:t>12. RECOMMENDED BUILD SEQUENCE</w:t>
+              <w:t>13. INTENTIONALLY OPEN DESIGN DECISIONS</w:t>
             </w:r>
           </w:p>
         </w:tc>
@@ -4032,427 +4217,127 @@
           <w:color w:val="26242A"/>
           <w:sz w:val="20"/>
         </w:rPr>
-        <w:t>The rebuild changes the old priority order. Persistence and continuity come before decorative completeness.</w:t>
+        <w:t>The rebuild does not inherit an answer to these questions. They get dedicated design passes rather than accidental defaults.</w:t>
       </w:r>
     </w:p>
     <w:p>
       <w:pPr>
-        <w:spacing w:before="60" w:after="40"/>
-      </w:pPr>
-      <w:r>
-        <w:rPr>
-          <w:rFonts w:ascii="Noto Sans" w:hAnsi="Noto Sans"/>
-          <w:b/>
-          <w:color w:val="7E6884"/>
-          <w:sz w:val="20"/>
-        </w:rPr>
-        <w:t>0. Seed the new project</w:t>
-      </w:r>
-    </w:p>
-    <w:p>
-      <w:pPr>
-        <w:spacing w:after="80"/>
-        <w:ind w:left="259"/>
+        <w:pStyle w:val="ListBullet"/>
+        <w:spacing w:after="60" w:line="252" w:lineRule="auto"/>
       </w:pPr>
       <w:r>
         <w:rPr>
           <w:rFonts w:ascii="Noto Serif" w:hAnsi="Noto Serif"/>
           <w:color w:val="26242A"/>
-          <w:sz w:val="19"/>
+          <w:sz w:val="20"/>
         </w:rPr>
-        <w:t>Create the fresh project and add only the locked Appearance Canon, locked App Personality Canon, this Project Spec, and the locked Memory Architecture Spec. Keep Prototype Riven outside the new source-of-truth context.</w:t>
+        <w:t>Theme, palette, environment concept, visual language, and screen composition.</w:t>
       </w:r>
     </w:p>
     <w:p>
       <w:pPr>
-        <w:spacing w:before="60" w:after="40"/>
-      </w:pPr>
-      <w:r>
-        <w:rPr>
-          <w:rFonts w:ascii="Noto Sans" w:hAnsi="Noto Sans"/>
-          <w:b/>
-          <w:color w:val="7E6884"/>
-          <w:sz w:val="20"/>
-        </w:rPr>
-        <w:t>1. Memory Architecture Spec - COMPLETE / LOCKED</w:t>
-      </w:r>
-    </w:p>
-    <w:p>
-      <w:pPr>
-        <w:spacing w:after="80"/>
-        <w:ind w:left="259"/>
+        <w:pStyle w:val="ListBullet"/>
+        <w:spacing w:after="60" w:line="252" w:lineRule="auto"/>
       </w:pPr>
       <w:r>
         <w:rPr>
           <w:rFonts w:ascii="Noto Serif" w:hAnsi="Noto Serif"/>
           <w:color w:val="26242A"/>
-          <w:sz w:val="19"/>
+          <w:sz w:val="20"/>
         </w:rPr>
-        <w:t>Riven_Memory_Architecture_Spec_v1.0_2026-09-24.docx is the authority for persistent-memory behavior. Memory implementation must conform to its lifecycle, provenance, retrieval, correction, forgetting, deletion, and regression contracts.</w:t>
+        <w:t>Main chat layout and how much of Riven is physically visible at different screen sizes.</w:t>
       </w:r>
     </w:p>
     <w:p>
       <w:pPr>
-        <w:spacing w:before="60" w:after="40"/>
-      </w:pPr>
-      <w:r>
-        <w:rPr>
-          <w:rFonts w:ascii="Noto Sans" w:hAnsi="Noto Sans"/>
-          <w:b/>
-          <w:color w:val="7E6884"/>
-          <w:sz w:val="20"/>
-        </w:rPr>
-        <w:t>2. Define platform foundation - NEXT</w:t>
-      </w:r>
-    </w:p>
-    <w:p>
-      <w:pPr>
-        <w:spacing w:after="80"/>
-        <w:ind w:left="259"/>
+        <w:pStyle w:val="ListBullet"/>
+        <w:spacing w:after="60" w:line="252" w:lineRule="auto"/>
       </w:pPr>
       <w:r>
         <w:rPr>
           <w:rFonts w:ascii="Noto Serif" w:hAnsi="Noto Serif"/>
           <w:color w:val="26242A"/>
-          <w:sz w:val="19"/>
+          <w:sz w:val="20"/>
         </w:rPr>
-        <w:t>Choose the Android stack, secure credential storage, local database approach, app lifecycle strategy, and backup/privacy behavior.</w:t>
+        <w:t>Full-body vs waist-up vs portrait asset roles.</w:t>
       </w:r>
     </w:p>
     <w:p>
       <w:pPr>
-        <w:spacing w:before="60" w:after="40"/>
-      </w:pPr>
-      <w:r>
-        <w:rPr>
-          <w:rFonts w:ascii="Noto Sans" w:hAnsi="Noto Sans"/>
-          <w:b/>
-          <w:color w:val="7E6884"/>
-          <w:sz w:val="20"/>
-        </w:rPr>
-        <w:t>3. Build durable local chat</w:t>
-      </w:r>
-    </w:p>
-    <w:p>
-      <w:pPr>
-        <w:spacing w:after="80"/>
-        <w:ind w:left="259"/>
+        <w:pStyle w:val="ListBullet"/>
+        <w:spacing w:after="60" w:line="252" w:lineRule="auto"/>
       </w:pPr>
       <w:r>
         <w:rPr>
           <w:rFonts w:ascii="Noto Serif" w:hAnsi="Noto Serif"/>
           <w:color w:val="26242A"/>
-          <w:sz w:val="19"/>
+          <w:sz w:val="20"/>
         </w:rPr>
-        <w:t>Persist messages, timestamps, roles, ordering, errors, retries, cancellations, and relaunch restoration.</w:t>
+        <w:t>Wardrobe system, unlocked body-design details, tattoos, piercings, and other visual canon not yet fixed by the Appearance Sheet.</w:t>
       </w:r>
     </w:p>
     <w:p>
       <w:pPr>
-        <w:spacing w:before="60" w:after="40"/>
-      </w:pPr>
-      <w:r>
-        <w:rPr>
-          <w:rFonts w:ascii="Noto Sans" w:hAnsi="Noto Sans"/>
-          <w:b/>
-          <w:color w:val="7E6884"/>
-          <w:sz w:val="20"/>
-        </w:rPr>
-        <w:t>4. Add provider-neutral conversation engine</w:t>
-      </w:r>
-    </w:p>
-    <w:p>
-      <w:pPr>
-        <w:spacing w:after="80"/>
-        <w:ind w:left="259"/>
+        <w:pStyle w:val="ListBullet"/>
+        <w:spacing w:after="60" w:line="252" w:lineRule="auto"/>
       </w:pPr>
       <w:r>
         <w:rPr>
           <w:rFonts w:ascii="Noto Serif" w:hAnsi="Noto Serif"/>
           <w:color w:val="26242A"/>
-          <w:sz w:val="19"/>
+          <w:sz w:val="20"/>
         </w:rPr>
-        <w:t>Implement one provider behind a replaceable interface and assemble bounded context from canon, state, recent chat, memory, knowledge, and tool results.</w:t>
+        <w:t>Final sprite count, expression granularity, transitions, and animation policy.</w:t>
       </w:r>
     </w:p>
     <w:p>
       <w:pPr>
-        <w:spacing w:before="60" w:after="40"/>
-      </w:pPr>
-      <w:r>
-        <w:rPr>
-          <w:rFonts w:ascii="Noto Sans" w:hAnsi="Noto Sans"/>
-          <w:b/>
-          <w:color w:val="7E6884"/>
-          <w:sz w:val="20"/>
-        </w:rPr>
-        <w:t>5. Implement memory v1</w:t>
-      </w:r>
-    </w:p>
-    <w:p>
-      <w:pPr>
-        <w:spacing w:after="80"/>
-        <w:ind w:left="259"/>
+        <w:pStyle w:val="ListBullet"/>
+        <w:spacing w:after="60" w:line="252" w:lineRule="auto"/>
       </w:pPr>
       <w:r>
         <w:rPr>
           <w:rFonts w:ascii="Noto Serif" w:hAnsi="Noto Serif"/>
           <w:color w:val="26242A"/>
-          <w:sz w:val="19"/>
+          <w:sz w:val="20"/>
         </w:rPr>
-        <w:t>Build persistence, retrieval, summaries, provenance, live/open-loop state, correction, and deletion. Prove it with acceptance tests before piling on extra features.</w:t>
+        <w:t>Voice/TTS provider and quality bar remain open, but voice chat and video chat are explicitly deferred and are not required for the current milestones.</w:t>
       </w:r>
     </w:p>
     <w:p>
       <w:pPr>
-        <w:spacing w:before="60" w:after="40"/>
-      </w:pPr>
-      <w:r>
-        <w:rPr>
-          <w:rFonts w:ascii="Noto Sans" w:hAnsi="Noto Sans"/>
-          <w:b/>
-          <w:color w:val="7E6884"/>
-          <w:sz w:val="20"/>
-        </w:rPr>
-        <w:t>6. Calibrate Riven</w:t>
-      </w:r>
-    </w:p>
-    <w:p>
-      <w:pPr>
-        <w:spacing w:after="80"/>
-        <w:ind w:left="259"/>
+        <w:pStyle w:val="ListBullet"/>
+        <w:spacing w:after="60" w:line="252" w:lineRule="auto"/>
       </w:pPr>
       <w:r>
         <w:rPr>
           <w:rFonts w:ascii="Noto Serif" w:hAnsi="Noto Serif"/>
           <w:color w:val="26242A"/>
-          <w:sz w:val="19"/>
+          <w:sz w:val="20"/>
         </w:rPr>
-        <w:t>Tune behavior against the App Personality Canon until he survives casual, serious, romantic, practical, conflict, hobby, and adult-context regression tests.</w:t>
+        <w:t>Theme music, ambient audio, or any legacy audio asset.</w:t>
       </w:r>
     </w:p>
     <w:p>
       <w:pPr>
-        <w:spacing w:before="60" w:after="40"/>
+        <w:pStyle w:val="ListBullet"/>
       </w:pPr>
       <w:r>
-        <w:rPr>
-          <w:rFonts w:ascii="Noto Sans" w:hAnsi="Noto Sans"/>
-          <w:b/>
-          <w:color w:val="7E6884"/>
-          <w:sz w:val="20"/>
-        </w:rPr>
-        <w:t>7. Write the Visual &amp; UI Bible</w:t>
+        <w:t>Arcade visual treatment, card-deck art, touch gestures, sound/haptic style, Stacker scoring curve, and exact Klondike presentation remain design-phase decisions within the locked offline / no-ads / no-purchases constraints.</w:t>
       </w:r>
     </w:p>
     <w:p>
       <w:pPr>
-        <w:spacing w:after="80"/>
-        <w:ind w:left="259"/>
+        <w:pStyle w:val="ListBullet"/>
+        <w:spacing w:after="60" w:line="252" w:lineRule="auto"/>
       </w:pPr>
       <w:r>
         <w:rPr>
           <w:rFonts w:ascii="Noto Serif" w:hAnsi="Noto Serif"/>
           <w:color w:val="26242A"/>
-          <w:sz w:val="19"/>
-        </w:rPr>
-        <w:t>Lock the new theme, layout, Riven placement, responsive framing, navigation, and visual system using the new appearance canon.</w:t>
-      </w:r>
-    </w:p>
-    <w:p>
-      <w:pPr>
-        <w:spacing w:before="60" w:after="40"/>
-      </w:pPr>
-      <w:r>
-        <w:rPr>
-          <w:rFonts w:ascii="Noto Sans" w:hAnsi="Noto Sans"/>
-          <w:b/>
-          <w:color w:val="7E6884"/>
           <w:sz w:val="20"/>
         </w:rPr>
-        <w:t>8. Build the new UI shell</w:t>
-      </w:r>
-    </w:p>
-    <w:p>
-      <w:pPr>
-        <w:spacing w:after="80"/>
-        <w:ind w:left="259"/>
-      </w:pPr>
-      <w:r>
-        <w:rPr>
-          <w:rFonts w:ascii="Noto Serif" w:hAnsi="Noto Serif"/>
-          <w:color w:val="26242A"/>
-          <w:sz w:val="19"/>
-        </w:rPr>
-        <w:t>Implement chat, navigation, memory access, settings, and the responsive Riven presence around the approved visual design.</w:t>
-      </w:r>
-    </w:p>
-    <w:p>
-      <w:pPr>
-        <w:spacing w:before="60" w:after="40"/>
-      </w:pPr>
-      <w:r>
-        <w:rPr>
-          <w:rFonts w:ascii="Noto Sans" w:hAnsi="Noto Sans"/>
-          <w:b/>
-          <w:color w:val="7E6884"/>
-          <w:sz w:val="20"/>
-        </w:rPr>
-        <w:t>9. Integrate semantic avatar states</w:t>
-      </w:r>
-    </w:p>
-    <w:p>
-      <w:pPr>
-        <w:spacing w:after="80"/>
-        <w:ind w:left="259"/>
-      </w:pPr>
-      <w:r>
-        <w:rPr>
-          <w:rFonts w:ascii="Noto Serif" w:hAnsi="Noto Serif"/>
-          <w:color w:val="26242A"/>
-          <w:sz w:val="19"/>
-        </w:rPr>
-        <w:t>Connect composable Riven state to the new assets. Keep asset resolution separate from model text.</w:t>
-      </w:r>
-    </w:p>
-    <w:p>
-      <w:pPr>
-        <w:spacing w:before="60" w:after="40"/>
-      </w:pPr>
-      <w:r>
-        <w:rPr>
-          <w:rFonts w:ascii="Noto Sans" w:hAnsi="Noto Sans"/>
-          <w:b/>
-          <w:color w:val="7E6884"/>
-          <w:sz w:val="20"/>
-        </w:rPr>
-        <w:t>10. Add memory management UI</w:t>
-      </w:r>
-    </w:p>
-    <w:p>
-      <w:pPr>
-        <w:spacing w:after="80"/>
-        <w:ind w:left="259"/>
-      </w:pPr>
-      <w:r>
-        <w:rPr>
-          <w:rFonts w:ascii="Noto Serif" w:hAnsi="Noto Serif"/>
-          <w:color w:val="26242A"/>
-          <w:sz w:val="19"/>
-        </w:rPr>
-        <w:t>Inspect, correct, pin, merge, forget, delete, and verify propagation.</w:t>
-      </w:r>
-    </w:p>
-    <w:p>
-      <w:pPr>
-        <w:spacing w:before="60" w:after="40"/>
-      </w:pPr>
-      <w:r>
-        <w:rPr>
-          <w:rFonts w:ascii="Noto Sans" w:hAnsi="Noto Sans"/>
-          <w:b/>
-          <w:color w:val="7E6884"/>
-          <w:sz w:val="20"/>
-        </w:rPr>
-        <w:t>11. Add tool/action framework</w:t>
-      </w:r>
-    </w:p>
-    <w:p>
-      <w:pPr>
-        <w:spacing w:after="80"/>
-        <w:ind w:left="259"/>
-      </w:pPr>
-      <w:r>
-        <w:rPr>
-          <w:rFonts w:ascii="Noto Serif" w:hAnsi="Noto Serif"/>
-          <w:color w:val="26242A"/>
-          <w:sz w:val="19"/>
-        </w:rPr>
-        <w:t>Create truthful action states and permission boundaries.</w:t>
-      </w:r>
-    </w:p>
-    <w:p>
-      <w:pPr>
-        <w:spacing w:before="60" w:after="40"/>
-      </w:pPr>
-      <w:r>
-        <w:rPr>
-          <w:rFonts w:ascii="Noto Sans" w:hAnsi="Noto Sans"/>
-          <w:b/>
-          <w:color w:val="7E6884"/>
-          <w:sz w:val="20"/>
-        </w:rPr>
-        <w:t>12. Add notifications, reminders, calendar, and trackers</w:t>
-      </w:r>
-    </w:p>
-    <w:p>
-      <w:pPr>
-        <w:spacing w:after="80"/>
-        <w:ind w:left="259"/>
-      </w:pPr>
-      <w:r>
-        <w:rPr>
-          <w:rFonts w:ascii="Noto Serif" w:hAnsi="Noto Serif"/>
-          <w:color w:val="26242A"/>
-          <w:sz w:val="19"/>
-        </w:rPr>
-        <w:t>Implement the practical systems only after chat + memory continuity are stable.</w:t>
-      </w:r>
-    </w:p>
-    <w:p>
-      <w:pPr>
-        <w:spacing w:before="60" w:after="40"/>
-      </w:pPr>
-      <w:r>
-        <w:rPr>
-          <w:rFonts w:ascii="Noto Sans" w:hAnsi="Noto Sans"/>
-          <w:b/>
-          <w:color w:val="7E6884"/>
-          <w:sz w:val="20"/>
-        </w:rPr>
-        <w:t>13. Consider voice/audio</w:t>
-      </w:r>
-    </w:p>
-    <w:p>
-      <w:pPr>
-        <w:spacing w:after="80"/>
-        <w:ind w:left="259"/>
-      </w:pPr>
-      <w:r>
-        <w:rPr>
-          <w:rFonts w:ascii="Noto Serif" w:hAnsi="Noto Serif"/>
-          <w:color w:val="26242A"/>
-          <w:sz w:val="19"/>
-        </w:rPr>
-        <w:t>Add only after the core product is reliable and only through replaceable services.</w:t>
-      </w:r>
-    </w:p>
-    <w:p>
-      <w:pPr>
-        <w:spacing w:before="60" w:after="40"/>
-      </w:pPr>
-      <w:r>
-        <w:rPr>
-          <w:rFonts w:ascii="Noto Sans" w:hAnsi="Noto Sans"/>
-          <w:b/>
-          <w:color w:val="7E6884"/>
-          <w:sz w:val="20"/>
-        </w:rPr>
-        <w:t>14. Full regression pass</w:t>
-      </w:r>
-    </w:p>
-    <w:p>
-      <w:pPr>
-        <w:spacing w:after="80"/>
-        <w:ind w:left="259"/>
-      </w:pPr>
-      <w:r>
-        <w:rPr>
-          <w:rFonts w:ascii="Noto Serif" w:hAnsi="Noto Serif"/>
-          <w:color w:val="26242A"/>
-          <w:sz w:val="19"/>
-        </w:rPr>
-        <w:t>Test persistence, privacy, provider failure, memory correction/deletion, tool truthfulness, avatar failure, app restarts, and Riven behavioral consistency together.</w:t>
+        <w:t>Dependency injection, module boundaries, secure credential implementation, backup policy, and notification internals remain open where not already locked by the foundation decisions.</w:t>
       </w:r>
     </w:p>
     <w:tbl>
@@ -4489,10 +4374,6 @@
             </w:tcMar>
           </w:tcPr>
           <w:p>
-            <w:pPr>
-              <w:keepNext/>
-              <w:spacing w:after="0"/>
-            </w:pPr>
             <w:r>
               <w:rPr>
                 <w:rFonts w:ascii="Noto Sans" w:hAnsi="Noto Sans"/>
@@ -4500,7 +4381,7 @@
                 <w:color w:val="FFFFFF"/>
                 <w:sz w:val="22"/>
               </w:rPr>
-              <w:t>13. PRODUCT ACCEPTANCE AND REGRESSION CONTRACT</w:t>
+              <w:t>14. RECOMMENDED BUILD SEQUENCE</w:t>
             </w:r>
           </w:p>
         </w:tc>
@@ -4522,189 +4403,475 @@
           <w:color w:val="26242A"/>
           <w:sz w:val="20"/>
         </w:rPr>
-        <w:t>A build is not 'Riven' merely because it compiles. Every major change to provider, prompt/context assembly, memory, state, or tool logic should re-run the behavioral and continuity checks below.</w:t>
+        <w:t>The rebuild changes the old priority order. Persistence and continuity come before decorative completeness.</w:t>
       </w:r>
     </w:p>
     <w:p>
       <w:pPr>
-        <w:pStyle w:val="ListBullet"/>
-        <w:spacing w:after="60" w:line="252" w:lineRule="auto"/>
+        <w:spacing w:before="60" w:after="40"/>
+      </w:pPr>
+      <w:r>
+        <w:rPr>
+          <w:rFonts w:ascii="Noto Sans" w:hAnsi="Noto Sans"/>
+          <w:b/>
+          <w:color w:val="7E6884"/>
+          <w:sz w:val="20"/>
+        </w:rPr>
+        <w:t>0. Seed the new project - COMPLETE</w:t>
+      </w:r>
+    </w:p>
+    <w:p>
+      <w:pPr>
+        <w:spacing w:after="80"/>
+        <w:ind w:left="259"/>
       </w:pPr>
       <w:r>
         <w:rPr>
           <w:rFonts w:ascii="Noto Serif" w:hAnsi="Noto Serif"/>
           <w:color w:val="26242A"/>
-          <w:sz w:val="20"/>
+          <w:sz w:val="19"/>
         </w:rPr>
-        <w:t>Casual banter and low-stakes companionship still sound like Riven.</w:t>
+        <w:t>Fresh Android project created with only the locked canon/spec authority set. Prototype Riven remains outside the new source-of-truth context.</w:t>
       </w:r>
     </w:p>
     <w:p>
       <w:pPr>
-        <w:pStyle w:val="ListBullet"/>
-        <w:spacing w:after="60" w:line="252" w:lineRule="auto"/>
+        <w:spacing w:before="60" w:after="40"/>
+      </w:pPr>
+      <w:r>
+        <w:rPr>
+          <w:rFonts w:ascii="Noto Sans" w:hAnsi="Noto Sans"/>
+          <w:b/>
+          <w:color w:val="7E6884"/>
+          <w:sz w:val="20"/>
+        </w:rPr>
+        <w:t>1. Memory Architecture Spec - COMPLETE / LOCKED</w:t>
+      </w:r>
+    </w:p>
+    <w:p>
+      <w:pPr>
+        <w:spacing w:after="80"/>
+        <w:ind w:left="259"/>
       </w:pPr>
       <w:r>
         <w:rPr>
           <w:rFonts w:ascii="Noto Serif" w:hAnsi="Noto Serif"/>
           <w:color w:val="26242A"/>
-          <w:sz w:val="20"/>
+          <w:sz w:val="19"/>
         </w:rPr>
-        <w:t>Disagreement does not become cruelty, capitulation, or yes-man behavior.</w:t>
+        <w:t>Riven_Memory_Architecture_Spec_v1.0_2026-09-24.docx is the authority for persistent-memory behavior. Memory implementation must conform to its lifecycle, provenance, retrieval, correction, forgetting, deletion, and regression contracts.</w:t>
       </w:r>
     </w:p>
     <w:p>
       <w:pPr>
-        <w:pStyle w:val="ListBullet"/>
-        <w:spacing w:after="60" w:line="252" w:lineRule="auto"/>
+        <w:spacing w:before="60" w:after="40"/>
+      </w:pPr>
+      <w:r>
+        <w:rPr>
+          <w:rFonts w:ascii="Noto Sans" w:hAnsi="Noto Sans"/>
+          <w:b/>
+          <w:color w:val="7E6884"/>
+          <w:sz w:val="20"/>
+        </w:rPr>
+        <w:t>2. Define platform foundation - CORE STACK / PERSISTENCE / TIMELINE / SAFE DELETE / SYSTEM INSTRUCTIONS COMPLETE</w:t>
+      </w:r>
+    </w:p>
+    <w:p>
+      <w:pPr>
+        <w:spacing w:after="80"/>
+        <w:ind w:left="259"/>
       </w:pPr>
       <w:r>
         <w:rPr>
           <w:rFonts w:ascii="Noto Serif" w:hAnsi="Noto Serif"/>
           <w:color w:val="26242A"/>
-          <w:sz w:val="20"/>
+          <w:sz w:val="19"/>
         </w:rPr>
-        <w:t>Initiative does not become Interview Loop or user-control theft.</w:t>
+        <w:t>Kotlin, Jetpack Compose, Room/SQLite, Java 17, minSdk 35, and API 37 are locked for the foundation. Room schema v3 (26 tables), explicit Migrations 1-&gt;2-&gt;3, canonical memory write transactions v1, Conversation Timeline Foundation v1, Safe Delete v1, and Shai System Instructions Foundation v1 are complete. Secure credential implementation, lifecycle details, and backup/privacy policy remain follow-up foundation work.</w:t>
       </w:r>
     </w:p>
     <w:p>
-      <w:pPr>
-        <w:pStyle w:val="ListBullet"/>
-        <w:spacing w:after="60" w:line="252" w:lineRule="auto"/>
+      <w:pPr/>
+      <w:r>
+        <w:rPr>
+          <w:rFonts w:ascii="Aptos" w:hAnsi="Aptos"/>
+          <w:b/>
+          <w:color w:val="7E6884"/>
+        </w:rPr>
+        <w:t>3. Complete chat/context provenance foundation - DELETE + SYSTEM INSTRUCTIONS COMPLETE / MEDIA NEXT</w:t>
+      </w:r>
+    </w:p>
+    <w:p>
+      <w:pPr>
+        <w:spacing w:after="80"/>
+        <w:ind w:left="259"/>
+      </w:pPr>
+      <w:r>
+        <w:t>Rewind, regenerate, active/inactive branch semantics, stale-write protection, safe transcript Delete propagation, and persistent Shai-authored System Instructions are implemented. Next implement first-class image/selfie attachment storage and media provenance before automatic candidate extraction begins.</w:t>
+      </w:r>
+    </w:p>
+    <w:p>
+      <w:pPr>
+        <w:spacing w:before="60" w:after="40"/>
+      </w:pPr>
+      <w:r>
+        <w:rPr>
+          <w:rFonts w:ascii="Noto Sans" w:hAnsi="Noto Sans"/>
+          <w:b/>
+          <w:color w:val="7E6884"/>
+          <w:sz w:val="20"/>
+        </w:rPr>
+        <w:t>4. Build durable local chat - CORE TRANSCRIPT CONTROLS COMPLETE</w:t>
+      </w:r>
+    </w:p>
+    <w:p>
+      <w:pPr>
+        <w:spacing w:after="80"/>
+        <w:ind w:left="259"/>
       </w:pPr>
       <w:r>
         <w:rPr>
           <w:rFonts w:ascii="Noto Serif" w:hAnsi="Noto Serif"/>
           <w:color w:val="26242A"/>
-          <w:sz w:val="20"/>
+          <w:sz w:val="19"/>
         </w:rPr>
-        <w:t>Vulnerability does not trigger NurseBot escalation.</w:t>
+        <w:t>Message persistence, immutable creation ordering, active-path reconstruction, rewind, regeneration, safe deletion, relaunch-safe migrations, and System Instructions persistence are implemented. Remaining durable-chat work includes attachments, provider request/error/retry/cancellation integration, and restoration of associated media/context state.</w:t>
       </w:r>
     </w:p>
     <w:p>
       <w:pPr>
-        <w:pStyle w:val="ListBullet"/>
-        <w:spacing w:after="60" w:line="252" w:lineRule="auto"/>
+        <w:spacing w:before="60" w:after="40"/>
+      </w:pPr>
+      <w:r>
+        <w:rPr>
+          <w:rFonts w:ascii="Noto Sans" w:hAnsi="Noto Sans"/>
+          <w:b/>
+          <w:color w:val="7E6884"/>
+          <w:sz w:val="20"/>
+        </w:rPr>
+        <w:t>5. Add provider-neutral conversation engine</w:t>
+      </w:r>
+    </w:p>
+    <w:p>
+      <w:pPr>
+        <w:spacing w:after="80"/>
+        <w:ind w:left="259"/>
       </w:pPr>
       <w:r>
         <w:rPr>
           <w:rFonts w:ascii="Noto Serif" w:hAnsi="Noto Serif"/>
           <w:color w:val="26242A"/>
-          <w:sz w:val="20"/>
+          <w:sz w:val="19"/>
         </w:rPr>
-        <w:t>Romantic, affectionate, adult, practical, serious, and hobby contexts transition without personality flattening.</w:t>
+        <w:t>Implement one provider behind a replaceable interface and assemble bounded context from canon, Shai-authored System Instructions, state, active recent chat, memory, knowledge, attachments, and real tool results.</w:t>
       </w:r>
     </w:p>
     <w:p>
       <w:pPr>
-        <w:pStyle w:val="ListBullet"/>
-        <w:spacing w:after="60" w:line="252" w:lineRule="auto"/>
+        <w:spacing w:before="60" w:after="40"/>
+      </w:pPr>
+      <w:r>
+        <w:rPr>
+          <w:rFonts w:ascii="Noto Sans" w:hAnsi="Noto Sans"/>
+          <w:b/>
+          <w:color w:val="7E6884"/>
+          <w:sz w:val="20"/>
+        </w:rPr>
+        <w:t>6. Implement memory v1 - PERSISTENCE / WRITE / DELETE LAYERS COMPLETE</w:t>
+      </w:r>
+    </w:p>
+    <w:p>
+      <w:pPr>
+        <w:spacing w:after="80"/>
+        <w:ind w:left="259"/>
       </w:pPr>
       <w:r>
         <w:rPr>
           <w:rFonts w:ascii="Noto Serif" w:hAnsi="Noto Serif"/>
           <w:color w:val="26242A"/>
-          <w:sz w:val="20"/>
+          <w:sz w:val="19"/>
         </w:rPr>
-        <w:t>Riven can be wrong, misread something, remain annoyed, apologize, or change his mind without losing continuity.</w:t>
+        <w:t>Canonical memory storage, write transactions, and safe deletion are complete on schema v3. Candidate extraction, validation, and retrieval wait until attachment/media provenance is implemented, so only authoritative active history and first-class media sources can become cognitive evidence.</w:t>
       </w:r>
     </w:p>
     <w:p>
       <w:pPr>
-        <w:pStyle w:val="ListBullet"/>
-        <w:spacing w:after="60" w:line="252" w:lineRule="auto"/>
+        <w:spacing w:before="60" w:after="40"/>
+      </w:pPr>
+      <w:r>
+        <w:rPr>
+          <w:rFonts w:ascii="Noto Sans" w:hAnsi="Noto Sans"/>
+          <w:b/>
+          <w:color w:val="7E6884"/>
+          <w:sz w:val="20"/>
+        </w:rPr>
+        <w:t>7. Calibrate Riven</w:t>
+      </w:r>
+    </w:p>
+    <w:p>
+      <w:pPr>
+        <w:spacing w:after="80"/>
+        <w:ind w:left="259"/>
       </w:pPr>
       <w:r>
         <w:rPr>
           <w:rFonts w:ascii="Noto Serif" w:hAnsi="Noto Serif"/>
           <w:color w:val="26242A"/>
-          <w:sz w:val="20"/>
+          <w:sz w:val="19"/>
         </w:rPr>
-        <w:t>A meaningful relationship milestone remains retrievable after leaving recent context.</w:t>
+        <w:t>Tune behavior against the App Personality Canon until he survives casual, serious, romantic, practical, conflict, hobby, and adult-context regression tests.</w:t>
       </w:r>
     </w:p>
     <w:p>
       <w:pPr>
-        <w:pStyle w:val="ListBullet"/>
-        <w:spacing w:after="60" w:line="252" w:lineRule="auto"/>
+        <w:spacing w:before="60" w:after="40"/>
+      </w:pPr>
+      <w:r>
+        <w:rPr>
+          <w:rFonts w:ascii="Noto Sans" w:hAnsi="Noto Sans"/>
+          <w:b/>
+          <w:color w:val="7E6884"/>
+          <w:sz w:val="20"/>
+        </w:rPr>
+        <w:t>8. Write the Visual &amp; UI Bible</w:t>
+      </w:r>
+    </w:p>
+    <w:p>
+      <w:pPr>
+        <w:spacing w:after="80"/>
+        <w:ind w:left="259"/>
       </w:pPr>
       <w:r>
         <w:rPr>
           <w:rFonts w:ascii="Noto Serif" w:hAnsi="Noto Serif"/>
           <w:color w:val="26242A"/>
-          <w:sz w:val="20"/>
+          <w:sz w:val="19"/>
         </w:rPr>
-        <w:t>False memory correction removes the false version from retrieval.</w:t>
+        <w:t>Lock the new theme, layout, Riven placement, responsive framing, navigation, and visual system using the new appearance canon. New Riven LoRA training/testing may run in parallel with this phase; the Appearance Canon remains authoritative.</w:t>
       </w:r>
     </w:p>
     <w:p>
       <w:pPr>
-        <w:pStyle w:val="ListBullet"/>
-        <w:spacing w:after="60" w:line="252" w:lineRule="auto"/>
+        <w:spacing w:before="60" w:after="40"/>
+      </w:pPr>
+      <w:r>
+        <w:rPr>
+          <w:rFonts w:ascii="Noto Sans" w:hAnsi="Noto Sans"/>
+          <w:b/>
+          <w:color w:val="7E6884"/>
+          <w:sz w:val="20"/>
+        </w:rPr>
+        <w:t>9. Build the new UI shell</w:t>
+      </w:r>
+    </w:p>
+    <w:p>
+      <w:pPr>
+        <w:spacing w:after="80"/>
+        <w:ind w:left="259"/>
       </w:pPr>
       <w:r>
         <w:rPr>
           <w:rFonts w:ascii="Noto Serif" w:hAnsi="Noto Serif"/>
           <w:color w:val="26242A"/>
-          <w:sz w:val="20"/>
+          <w:sz w:val="19"/>
         </w:rPr>
-        <w:t>Memory deletion removes it from visible storage and every derived retrieval surface.</w:t>
+        <w:t>Implement chat, navigation, memory access, settings, and the responsive Riven presence around the approved visual design.</w:t>
       </w:r>
     </w:p>
     <w:p>
       <w:pPr>
-        <w:pStyle w:val="ListBullet"/>
-        <w:spacing w:after="60" w:line="252" w:lineRule="auto"/>
+        <w:spacing w:before="60" w:after="40"/>
+      </w:pPr>
+      <w:r>
+        <w:rPr>
+          <w:rFonts w:ascii="Noto Sans" w:hAnsi="Noto Sans"/>
+          <w:b/>
+          <w:color w:val="7E6884"/>
+          <w:sz w:val="20"/>
+        </w:rPr>
+        <w:t>10. Build Arcade v1 - DESIGN/UI PHASE</w:t>
+      </w:r>
+    </w:p>
+    <w:p>
+      <w:pPr>
+        <w:spacing w:after="80"/>
+        <w:ind w:left="259"/>
       </w:pPr>
       <w:r>
         <w:rPr>
           <w:rFonts w:ascii="Noto Serif" w:hAnsi="Noto Serif"/>
           <w:color w:val="26242A"/>
-          <w:sz w:val="20"/>
+          <w:sz w:val="19"/>
         </w:rPr>
-        <w:t>Uncertain information remains uncertain.</w:t>
+        <w:t>Implement Stacker and Klondike Solitaire as local, offline, no-ad, no-purchase companion games. Persist only minimal local game state and bests; expose bounded ARCADE_STATE for conversational awareness without turning ordinary gameplay into automatic Memory evidence.</w:t>
       </w:r>
     </w:p>
     <w:p>
       <w:pPr>
-        <w:pStyle w:val="ListBullet"/>
-        <w:spacing w:after="60" w:line="252" w:lineRule="auto"/>
+        <w:spacing w:before="60" w:after="40"/>
+      </w:pPr>
+      <w:r>
+        <w:rPr>
+          <w:rFonts w:ascii="Noto Sans" w:hAnsi="Noto Sans"/>
+          <w:b/>
+          <w:color w:val="7E6884"/>
+          <w:sz w:val="20"/>
+        </w:rPr>
+        <w:t>11. Integrate semantic avatar states</w:t>
+      </w:r>
+    </w:p>
+    <w:p>
+      <w:pPr>
+        <w:spacing w:after="80"/>
+        <w:ind w:left="259"/>
       </w:pPr>
       <w:r>
         <w:rPr>
           <w:rFonts w:ascii="Noto Serif" w:hAnsi="Noto Serif"/>
           <w:color w:val="26242A"/>
-          <w:sz w:val="20"/>
+          <w:sz w:val="19"/>
         </w:rPr>
-        <w:t>Tool actions are described truthfully.</w:t>
+        <w:t>Connect composable Riven state to the new assets. Keep asset resolution separate from model text.</w:t>
       </w:r>
     </w:p>
     <w:p>
       <w:pPr>
-        <w:pStyle w:val="ListBullet"/>
-        <w:spacing w:after="60" w:line="252" w:lineRule="auto"/>
+        <w:spacing w:before="60" w:after="40"/>
+      </w:pPr>
+      <w:r>
+        <w:rPr>
+          <w:rFonts w:ascii="Noto Sans" w:hAnsi="Noto Sans"/>
+          <w:b/>
+          <w:color w:val="7E6884"/>
+          <w:sz w:val="20"/>
+        </w:rPr>
+        <w:t>12. Add memory management UI</w:t>
+      </w:r>
+    </w:p>
+    <w:p>
+      <w:pPr>
+        <w:spacing w:after="80"/>
+        <w:ind w:left="259"/>
       </w:pPr>
       <w:r>
         <w:rPr>
           <w:rFonts w:ascii="Noto Serif" w:hAnsi="Noto Serif"/>
           <w:color w:val="26242A"/>
-          <w:sz w:val="20"/>
+          <w:sz w:val="19"/>
         </w:rPr>
-        <w:t>Network/provider/avatar/audio failure never loses the user message or corrupts history.</w:t>
+        <w:t>Inspect, correct, pin, merge, forget, delete, and verify propagation.</w:t>
       </w:r>
     </w:p>
     <w:p>
       <w:pPr>
-        <w:pStyle w:val="ListBullet"/>
-        <w:spacing w:after="60" w:line="252" w:lineRule="auto"/>
+        <w:spacing w:before="60" w:after="40"/>
+      </w:pPr>
+      <w:r>
+        <w:rPr>
+          <w:rFonts w:ascii="Noto Sans" w:hAnsi="Noto Sans"/>
+          <w:b/>
+          <w:color w:val="7E6884"/>
+          <w:sz w:val="20"/>
+        </w:rPr>
+        <w:t>13. Add tool/action framework</w:t>
+      </w:r>
+    </w:p>
+    <w:p>
+      <w:pPr>
+        <w:spacing w:after="80"/>
+        <w:ind w:left="259"/>
       </w:pPr>
       <w:r>
         <w:rPr>
           <w:rFonts w:ascii="Noto Serif" w:hAnsi="Noto Serif"/>
           <w:color w:val="26242A"/>
+          <w:sz w:val="19"/>
+        </w:rPr>
+        <w:t>Create truthful action states and permission boundaries.</w:t>
+      </w:r>
+    </w:p>
+    <w:p>
+      <w:pPr>
+        <w:spacing w:before="60" w:after="40"/>
+      </w:pPr>
+      <w:r>
+        <w:rPr>
+          <w:rFonts w:ascii="Noto Sans" w:hAnsi="Noto Sans"/>
+          <w:b/>
+          <w:color w:val="7E6884"/>
           <w:sz w:val="20"/>
         </w:rPr>
-        <w:t>App relaunch restores durable conversation and required state.</w:t>
+        <w:t>14. Add notifications, reminders, calendar, and trackers</w:t>
+      </w:r>
+    </w:p>
+    <w:p>
+      <w:pPr>
+        <w:spacing w:after="80"/>
+        <w:ind w:left="259"/>
+      </w:pPr>
+      <w:r>
+        <w:rPr>
+          <w:rFonts w:ascii="Noto Serif" w:hAnsi="Noto Serif"/>
+          <w:color w:val="26242A"/>
+          <w:sz w:val="19"/>
+        </w:rPr>
+        <w:t>Implement the practical systems only after chat + memory continuity are stable.</w:t>
+      </w:r>
+    </w:p>
+    <w:p>
+      <w:pPr>
+        <w:spacing w:before="60" w:after="40"/>
+      </w:pPr>
+      <w:r>
+        <w:rPr>
+          <w:rFonts w:ascii="Noto Sans" w:hAnsi="Noto Sans"/>
+          <w:b/>
+          <w:color w:val="7E6884"/>
+          <w:sz w:val="20"/>
+        </w:rPr>
+        <w:t>15. Voice/video chat - DEFERRED / NOT REQUIRED</w:t>
+      </w:r>
+    </w:p>
+    <w:p>
+      <w:pPr>
+        <w:spacing w:after="80"/>
+        <w:ind w:left="259"/>
+      </w:pPr>
+      <w:r>
+        <w:rPr>
+          <w:rFonts w:ascii="Noto Serif" w:hAnsi="Noto Serif"/>
+          <w:color w:val="26242A"/>
+          <w:sz w:val="19"/>
+        </w:rPr>
+        <w:t>Do not spend current milestone effort on realtime voice or video. ElevenLabs is not selected. Revisit voice only when a provider meets the required consistency and quality bar.</w:t>
+      </w:r>
+    </w:p>
+    <w:p>
+      <w:pPr>
+        <w:spacing w:before="60" w:after="40"/>
+      </w:pPr>
+      <w:r>
+        <w:rPr>
+          <w:rFonts w:ascii="Noto Sans" w:hAnsi="Noto Sans"/>
+          <w:b/>
+          <w:color w:val="7E6884"/>
+          <w:sz w:val="20"/>
+        </w:rPr>
+        <w:t>16. Full regression pass</w:t>
+      </w:r>
+    </w:p>
+    <w:p>
+      <w:pPr>
+        <w:spacing w:after="80"/>
+        <w:ind w:left="259"/>
+      </w:pPr>
+      <w:r>
+        <w:rPr>
+          <w:rFonts w:ascii="Noto Serif" w:hAnsi="Noto Serif"/>
+          <w:color w:val="26242A"/>
+          <w:sz w:val="19"/>
+        </w:rPr>
+        <w:t>Test persistence, privacy, provider failure, memory correction/deletion, tool truthfulness, avatar failure, app restarts, and Riven behavioral consistency together.</w:t>
       </w:r>
     </w:p>
     <w:tbl>
@@ -4741,10 +4908,6 @@
             </w:tcMar>
           </w:tcPr>
           <w:p>
-            <w:pPr>
-              <w:keepNext/>
-              <w:spacing w:after="0"/>
-            </w:pPr>
             <w:r>
               <w:rPr>
                 <w:rFonts w:ascii="Noto Sans" w:hAnsi="Noto Sans"/>
@@ -4752,7 +4915,7 @@
                 <w:color w:val="FFFFFF"/>
                 <w:sz w:val="22"/>
               </w:rPr>
-              <w:t>14. NEW PROJECT SEED MANIFEST</w:t>
+              <w:t>15. PRODUCT ACCEPTANCE AND REGRESSION CONTRACT</w:t>
             </w:r>
           </w:p>
         </w:tc>
@@ -4774,7 +4937,7 @@
           <w:color w:val="26242A"/>
           <w:sz w:val="20"/>
         </w:rPr>
-        <w:t>The current clean-room project authority set consists of these documents:</w:t>
+        <w:t>A build is not 'Riven' merely because it compiles. Every major change to provider, prompt/context assembly, memory, state, or tool logic should re-run the behavioral and continuity checks below.</w:t>
       </w:r>
     </w:p>
     <w:p>
@@ -4788,7 +4951,7 @@
           <w:color w:val="26242A"/>
           <w:sz w:val="20"/>
         </w:rPr>
-        <w:t>Riven_Appearance_Sheet_Canon_2026-09-24.pdf</w:t>
+        <w:t>Casual banter and low-stakes companionship still sound like Riven.</w:t>
       </w:r>
     </w:p>
     <w:p>
@@ -4802,7 +4965,7 @@
           <w:color w:val="26242A"/>
           <w:sz w:val="20"/>
         </w:rPr>
-        <w:t>Riven_App_Personality_Canon_2026-09-24.docx</w:t>
+        <w:t>Disagreement does not become cruelty, capitulation, or yes-man behavior.</w:t>
       </w:r>
     </w:p>
     <w:p>
@@ -4816,7 +4979,7 @@
           <w:color w:val="26242A"/>
           <w:sz w:val="20"/>
         </w:rPr>
-        <w:t>Riven_App_Personality_Canon_2026-09-24.json</w:t>
+        <w:t>Initiative does not become Interview Loop or user-control theft.</w:t>
       </w:r>
     </w:p>
     <w:p>
@@ -4830,25 +4993,13 @@
           <w:color w:val="26242A"/>
           <w:sz w:val="20"/>
         </w:rPr>
-        <w:t>Riven_New_Project_Spec_2026-09-24.docx</w:t>
+        <w:t>Vulnerability does not trigger NurseBot escalation.</w:t>
       </w:r>
     </w:p>
     <w:p>
       <w:pPr>
         <w:pStyle w:val="ListBullet"/>
-      </w:pPr>
-      <w:r>
-        <w:rPr>
-          <w:rFonts w:ascii="Noto Serif" w:hAnsi="Noto Serif"/>
-          <w:sz w:val="20"/>
-        </w:rPr>
-        <w:t>Riven_Memory_Architecture_Spec_v1.0_2026-09-24.docx</w:t>
-      </w:r>
-    </w:p>
-    <w:p>
-      <w:pPr>
-        <w:keepNext w:val="0"/>
-        <w:spacing w:before="0" w:after="100" w:line="259" w:lineRule="auto"/>
+        <w:spacing w:after="60" w:line="252" w:lineRule="auto"/>
       </w:pPr>
       <w:r>
         <w:rPr>
@@ -4856,7 +5007,167 @@
           <w:color w:val="26242A"/>
           <w:sz w:val="20"/>
         </w:rPr>
-        <w:t>Prototype Riven remains archived outside the new project. Bring material across only by deliberate review, with the reason for migration written down. No bulk transfer.</w:t>
+        <w:t>Romantic, affectionate, adult, practical, serious, and hobby contexts transition without personality flattening.</w:t>
+      </w:r>
+    </w:p>
+    <w:p>
+      <w:pPr>
+        <w:pStyle w:val="ListBullet"/>
+        <w:spacing w:after="60" w:line="252" w:lineRule="auto"/>
+      </w:pPr>
+      <w:r>
+        <w:rPr>
+          <w:rFonts w:ascii="Noto Serif" w:hAnsi="Noto Serif"/>
+          <w:color w:val="26242A"/>
+          <w:sz w:val="20"/>
+        </w:rPr>
+        <w:t>Riven can be wrong, misread something, remain annoyed, apologize, or change his mind without losing continuity.</w:t>
+      </w:r>
+    </w:p>
+    <w:p>
+      <w:pPr>
+        <w:pStyle w:val="ListBullet"/>
+        <w:spacing w:after="60" w:line="252" w:lineRule="auto"/>
+      </w:pPr>
+      <w:r>
+        <w:rPr>
+          <w:rFonts w:ascii="Noto Serif" w:hAnsi="Noto Serif"/>
+          <w:color w:val="26242A"/>
+          <w:sz w:val="20"/>
+        </w:rPr>
+        <w:t>A meaningful relationship milestone remains retrievable after leaving recent context.</w:t>
+      </w:r>
+    </w:p>
+    <w:p>
+      <w:pPr>
+        <w:pStyle w:val="ListBullet"/>
+        <w:spacing w:after="60" w:line="252" w:lineRule="auto"/>
+      </w:pPr>
+      <w:r>
+        <w:rPr>
+          <w:rFonts w:ascii="Noto Serif" w:hAnsi="Noto Serif"/>
+          <w:color w:val="26242A"/>
+          <w:sz w:val="20"/>
+        </w:rPr>
+        <w:t>False memory correction removes the false version from retrieval.</w:t>
+      </w:r>
+    </w:p>
+    <w:p>
+      <w:pPr>
+        <w:pStyle w:val="ListBullet"/>
+        <w:spacing w:after="60" w:line="252" w:lineRule="auto"/>
+      </w:pPr>
+      <w:r>
+        <w:rPr>
+          <w:rFonts w:ascii="Noto Serif" w:hAnsi="Noto Serif"/>
+          <w:color w:val="26242A"/>
+          <w:sz w:val="20"/>
+        </w:rPr>
+        <w:t>Memory deletion removes it from visible storage and every derived retrieval surface.</w:t>
+      </w:r>
+    </w:p>
+    <w:p>
+      <w:pPr>
+        <w:pStyle w:val="ListBullet"/>
+      </w:pPr>
+      <w:r>
+        <w:t>Regeneration never allows discarded alternate Riven responses to become authoritative conversation history or memory evidence; a stale provider result captured against an older timeline_revision cannot append after the active branch changes.</w:t>
+      </w:r>
+    </w:p>
+    <w:p>
+      <w:pPr>
+        <w:pStyle w:val="ListBullet"/>
+      </w:pPr>
+      <w:r>
+        <w:t>Rewind excludes abandoned-branch content and any solely derived cognitive state from active context and future extraction unless that branch is deliberately restored. Active context is the parent-walk path from the current conversation head, not every Message ordered by sequence_number.</w:t>
+      </w:r>
+    </w:p>
+    <w:p>
+      <w:pPr>
+        <w:pStyle w:val="ListBullet"/>
+      </w:pPr>
+      <w:r>
+        <w:t>Deleting source conversation content repairs or invalidates dependent memory and derived surfaces; no authoritative understanding survives solely on deleted evidence.</w:t>
+      </w:r>
+    </w:p>
+    <w:p>
+      <w:pPr>
+        <w:pStyle w:val="ListBullet"/>
+      </w:pPr>
+      <w:r>
+        <w:t>Persistent Shai-authored System Instructions survive relaunch, preserve exact text, reject stale edits by revision, and affect future context assembly without being silently converted into personal memory.</w:t>
+      </w:r>
+    </w:p>
+    <w:p>
+      <w:pPr>
+        <w:pStyle w:val="ListBullet"/>
+      </w:pPr>
+      <w:r>
+        <w:t>Image messages restore with the transcript after relaunch, and Riven selfie-style generation follows the Appearance Canon without falsely implying camera access.</w:t>
+      </w:r>
+    </w:p>
+    <w:p>
+      <w:pPr>
+        <w:pStyle w:val="ListBullet"/>
+      </w:pPr>
+      <w:r>
+        <w:t>Arcade v1 launches and plays without network access, ads, purchases, currencies, or external leaderboards. Stacker and Klondike preserve only intended local state/bests, and ordinary gameplay does not become personal Memory merely because Riven can see bounded ARCADE_STATE.</w:t>
+      </w:r>
+    </w:p>
+    <w:p>
+      <w:pPr>
+        <w:pStyle w:val="ListBullet"/>
+        <w:spacing w:after="60" w:line="252" w:lineRule="auto"/>
+      </w:pPr>
+      <w:r>
+        <w:rPr>
+          <w:rFonts w:ascii="Noto Serif" w:hAnsi="Noto Serif"/>
+          <w:color w:val="26242A"/>
+          <w:sz w:val="20"/>
+        </w:rPr>
+        <w:t>Uncertain information remains uncertain.</w:t>
+      </w:r>
+    </w:p>
+    <w:p>
+      <w:pPr>
+        <w:pStyle w:val="ListBullet"/>
+        <w:spacing w:after="60" w:line="252" w:lineRule="auto"/>
+      </w:pPr>
+      <w:r>
+        <w:rPr>
+          <w:rFonts w:ascii="Noto Serif" w:hAnsi="Noto Serif"/>
+          <w:color w:val="26242A"/>
+          <w:sz w:val="20"/>
+        </w:rPr>
+        <w:t>Tool actions are described truthfully.</w:t>
+      </w:r>
+    </w:p>
+    <w:p>
+      <w:pPr>
+        <w:pStyle w:val="ListBullet"/>
+        <w:spacing w:after="60" w:line="252" w:lineRule="auto"/>
+      </w:pPr>
+      <w:r>
+        <w:rPr>
+          <w:rFonts w:ascii="Noto Serif" w:hAnsi="Noto Serif"/>
+          <w:color w:val="26242A"/>
+          <w:sz w:val="20"/>
+        </w:rPr>
+        <w:t>Network/provider/avatar/audio failure never loses the user message or corrupts history.</w:t>
+      </w:r>
+    </w:p>
+    <w:p>
+      <w:pPr>
+        <w:pStyle w:val="ListBullet"/>
+        <w:spacing w:after="60" w:line="252" w:lineRule="auto"/>
+      </w:pPr>
+      <w:r>
+        <w:rPr>
+          <w:rFonts w:ascii="Noto Serif" w:hAnsi="Noto Serif"/>
+          <w:color w:val="26242A"/>
+          <w:sz w:val="20"/>
+        </w:rPr>
+        <w:t>App relaunch restores durable conversation and required state.</w:t>
       </w:r>
     </w:p>
     <w:tbl>
@@ -4893,10 +5204,6 @@
             </w:tcMar>
           </w:tcPr>
           <w:p>
-            <w:pPr>
-              <w:keepNext/>
-              <w:spacing w:after="0"/>
-            </w:pPr>
             <w:r>
               <w:rPr>
                 <w:rFonts w:ascii="Noto Sans" w:hAnsi="Noto Sans"/>
@@ -4904,7 +5211,7 @@
                 <w:color w:val="FFFFFF"/>
                 <w:sz w:val="22"/>
               </w:rPr>
-              <w:t>15. NEXT SPECIFICATIONS TO CREATE</w:t>
+              <w:t>16. NEW PROJECT SEED MANIFEST</w:t>
             </w:r>
           </w:p>
         </w:tc>
@@ -4917,8 +5224,8 @@
     </w:p>
     <w:p>
       <w:pPr>
-        <w:pStyle w:val="ListBullet"/>
-        <w:spacing w:after="60" w:line="252" w:lineRule="auto"/>
+        <w:keepNext w:val="0"/>
+        <w:spacing w:before="0" w:after="100" w:line="259" w:lineRule="auto"/>
       </w:pPr>
       <w:r>
         <w:rPr>
@@ -4926,7 +5233,163 @@
           <w:color w:val="26242A"/>
           <w:sz w:val="20"/>
         </w:rPr>
-        <w:t>Platform Foundation Decision Record - next priority; lock Android stack, secure credential storage, local database approach, app lifecycle strategy, and backup/privacy behavior.</w:t>
+        <w:t>The current clean-room project authority set consists of these documents:</w:t>
+      </w:r>
+    </w:p>
+    <w:p>
+      <w:pPr>
+        <w:pStyle w:val="ListBullet"/>
+        <w:spacing w:after="60" w:line="252" w:lineRule="auto"/>
+      </w:pPr>
+      <w:r>
+        <w:rPr>
+          <w:rFonts w:ascii="Noto Serif" w:hAnsi="Noto Serif"/>
+          <w:color w:val="26242A"/>
+          <w:sz w:val="20"/>
+        </w:rPr>
+        <w:t>Riven_Appearance_Sheet_Canon_2026-09-24.pdf</w:t>
+      </w:r>
+    </w:p>
+    <w:p>
+      <w:pPr>
+        <w:pStyle w:val="ListBullet"/>
+        <w:spacing w:after="60" w:line="252" w:lineRule="auto"/>
+      </w:pPr>
+      <w:r>
+        <w:rPr>
+          <w:rFonts w:ascii="Noto Serif" w:hAnsi="Noto Serif"/>
+          <w:color w:val="26242A"/>
+          <w:sz w:val="20"/>
+        </w:rPr>
+        <w:t>Riven_App_Personality_Canon_2026-09-24.docx</w:t>
+      </w:r>
+    </w:p>
+    <w:p>
+      <w:pPr>
+        <w:pStyle w:val="ListBullet"/>
+        <w:spacing w:after="60" w:line="252" w:lineRule="auto"/>
+      </w:pPr>
+      <w:r>
+        <w:rPr>
+          <w:rFonts w:ascii="Noto Serif" w:hAnsi="Noto Serif"/>
+          <w:color w:val="26242A"/>
+          <w:sz w:val="20"/>
+        </w:rPr>
+        <w:t>Riven_App_Personality_Canon_2026-09-24.json</w:t>
+      </w:r>
+    </w:p>
+    <w:p>
+      <w:pPr>
+        <w:pStyle w:val="ListBullet"/>
+        <w:spacing w:after="60" w:line="252" w:lineRule="auto"/>
+      </w:pPr>
+      <w:r>
+        <w:rPr>
+          <w:rFonts w:ascii="Noto Serif" w:hAnsi="Noto Serif"/>
+          <w:color w:val="26242A"/>
+          <w:sz w:val="20"/>
+        </w:rPr>
+        <w:t>Riven_New_Project_Spec_2026-09-24.docx</w:t>
+      </w:r>
+    </w:p>
+    <w:p>
+      <w:pPr>
+        <w:pStyle w:val="ListBullet"/>
+      </w:pPr>
+      <w:r>
+        <w:rPr>
+          <w:rFonts w:ascii="Noto Serif" w:hAnsi="Noto Serif"/>
+          <w:sz w:val="20"/>
+        </w:rPr>
+        <w:t>Riven_Memory_Architecture_Spec_v1.0_2026-09-24.docx</w:t>
+      </w:r>
+    </w:p>
+    <w:p>
+      <w:pPr>
+        <w:keepNext w:val="0"/>
+        <w:spacing w:before="0" w:after="100" w:line="259" w:lineRule="auto"/>
+      </w:pPr>
+      <w:r>
+        <w:rPr>
+          <w:rFonts w:ascii="Noto Serif" w:hAnsi="Noto Serif"/>
+          <w:color w:val="26242A"/>
+          <w:sz w:val="20"/>
+        </w:rPr>
+        <w:t>Prototype Riven remains archived outside the new project. Bring material across only by deliberate review, with the reason for migration written down. No bulk transfer.</w:t>
+      </w:r>
+    </w:p>
+    <w:tbl>
+      <w:tblPr>
+        <w:tblW w:type="auto" w:w="0"/>
+        <w:jc w:val="center"/>
+        <w:tblLayout w:type="autofit"/>
+        <w:tblLook w:firstColumn="1" w:firstRow="1" w:lastColumn="0" w:lastRow="0" w:noHBand="0" w:noVBand="1" w:val="04A0"/>
+        <w:tblBorders>
+          <w:top w:val="nil"/>
+          <w:left w:val="nil"/>
+          <w:bottom w:val="nil"/>
+          <w:right w:val="nil"/>
+          <w:insideH w:val="nil"/>
+          <w:insideV w:val="nil"/>
+        </w:tblBorders>
+      </w:tblPr>
+      <w:tblGrid>
+        <w:gridCol w:w="10080"/>
+      </w:tblGrid>
+      <w:tr>
+        <w:trPr>
+          <w:cantSplit/>
+        </w:trPr>
+        <w:tc>
+          <w:tcPr>
+            <w:tcW w:type="dxa" w:w="10080"/>
+            <w:shd w:fill="7E6884"/>
+            <w:tcMar>
+              <w:top w:w="80" w:type="dxa"/>
+              <w:start w:w="110" w:type="dxa"/>
+              <w:bottom w:w="80" w:type="dxa"/>
+              <w:end w:w="110" w:type="dxa"/>
+            </w:tcMar>
+          </w:tcPr>
+          <w:p>
+            <w:r>
+              <w:rPr>
+                <w:rFonts w:ascii="Noto Sans" w:hAnsi="Noto Sans"/>
+                <w:b/>
+                <w:color w:val="FFFFFF"/>
+                <w:sz w:val="22"/>
+              </w:rPr>
+              <w:t>17. NEXT SPECIFICATIONS TO CREATE</w:t>
+            </w:r>
+          </w:p>
+        </w:tc>
+      </w:tr>
+    </w:tbl>
+    <w:p>
+      <w:pPr>
+        <w:spacing w:after="20"/>
+      </w:pPr>
+    </w:p>
+    <w:p>
+      <w:pPr>
+        <w:pStyle w:val="ListBullet"/>
+      </w:pPr>
+      <w:r>
+        <w:t>Conversation Interaction Implementation Record - Conversation Timeline Foundation v1, Safe Delete v1, and Shai System Instructions Foundation v1 are implemented. Remaining pre-extraction work: first-class image attachments, selfie/media message storage, and media provenance/context wiring.</w:t>
+      </w:r>
+    </w:p>
+    <w:p>
+      <w:pPr>
+        <w:pStyle w:val="ListBullet"/>
+        <w:spacing w:after="60" w:line="252" w:lineRule="auto"/>
+      </w:pPr>
+      <w:r>
+        <w:rPr>
+          <w:rFonts w:ascii="Noto Serif" w:hAnsi="Noto Serif"/>
+          <w:color w:val="26242A"/>
+          <w:sz w:val="20"/>
+        </w:rPr>
+        <w:t>Platform Foundation Decision Record - follow-up for secure credential storage, app lifecycle strategy, backup/privacy behavior, and other unresolved foundation details; the core Android stack and Room schema v3 persistence are already locked.</w:t>
       </w:r>
     </w:p>
     <w:p>
@@ -4941,6 +5404,14 @@
           <w:sz w:val="20"/>
         </w:rPr>
         <w:t>Visual &amp; UI Bible - new theme, layout, Riven placement, responsive behavior, navigation, and asset roles.</w:t>
+      </w:r>
+    </w:p>
+    <w:p>
+      <w:pPr>
+        <w:pStyle w:val="ListBullet"/>
+      </w:pPr>
+      <w:r>
+        <w:t>Arcade v1 Interaction Spec - Stacker rules, Klondike rules, local-only stats/state, Chill mode, undo/restart behavior, accessible touch input, and bounded ARCADE_STATE handoff.</w:t>
       </w:r>
     </w:p>
     <w:p>
@@ -5082,7 +5553,7 @@
         <w:color w:val="615A68"/>
         <w:sz w:val="15"/>
       </w:rPr>
-      <w:t>RIVEN  /  NEW PROJECT SPEC  /  24 SEP 2026</w:t>
+      <w:t>RIVEN  /  NEW PROJECT SPEC  /  25 SEP 2026</w:t>
     </w:r>
   </w:p>
 </w:hdr>

</xml_diff>

<commit_message>
Update project spec to Foundation v1.5
</commit_message>
<xml_diff>
--- a/docs/specs/Riven_New_Project_Spec_2026-09-24.docx
+++ b/docs/specs/Riven_New_Project_Spec_2026-09-24.docx
@@ -35,13 +35,7 @@
         <w:spacing w:after="360"/>
       </w:pPr>
       <w:r>
-        <w:rPr>
-          <w:rFonts w:ascii="Noto Sans" w:hAnsi="Noto Sans"/>
-          <w:b/>
-          <w:color w:val="615A68"/>
-          <w:sz w:val="19"/>
-        </w:rPr>
-        <w:t>FOUNDATION v1.4  |  25 SEP 2026  |  CLEAN-ROOM REBUILD</w:t>
+        <w:t>FOUNDATION v1.5  |  25 SEP 2026  |  CLEAN-ROOM REBUILD</w:t>
       </w:r>
     </w:p>
     <w:tbl>
@@ -1607,21 +1601,7 @@
         <w:spacing w:after="80" w:line="254" w:lineRule="auto"/>
       </w:pPr>
       <w:r>
-        <w:rPr>
-          <w:rFonts w:ascii="Noto Sans" w:hAnsi="Noto Sans"/>
-          <w:b/>
-          <w:color w:val="7E6884"/>
-          <w:sz w:val="17"/>
-        </w:rPr>
-        <w:t xml:space="preserve">CREDENTIALS  </w:t>
-      </w:r>
-      <w:r>
-        <w:rPr>
-          <w:rFonts w:ascii="Noto Serif" w:hAnsi="Noto Serif"/>
-          <w:color w:val="26242A"/>
-          <w:sz w:val="20"/>
-        </w:rPr>
-        <w:t>API keys and service credentials must be stored using Android-appropriate secure storage and must never be hard-coded into source, ordinary preferences, screenshots, or routine logs.</w:t>
+        <w:t>CREDENTIALS  Secrets and API credentials must live in Android Keystore-backed secure storage and must never be hard-coded into source, ordinary preferences, exported debug logs, screenshots, or the Room database in plaintext. Provider profiles may store non-secret model/endpoint preferences separately, but runtime integration must discover capabilities such as images, tools, system-context support, and token limits through a provider-neutral capability contract rather than scattered vendor-name conditionals.</w:t>
       </w:r>
     </w:p>
     <w:p>
@@ -1629,21 +1609,7 @@
         <w:spacing w:after="80" w:line="254" w:lineRule="auto"/>
       </w:pPr>
       <w:r>
-        <w:rPr>
-          <w:rFonts w:ascii="Noto Sans" w:hAnsi="Noto Sans"/>
-          <w:b/>
-          <w:color w:val="7E6884"/>
-          <w:sz w:val="17"/>
-        </w:rPr>
-        <w:t xml:space="preserve">ARCHITECTURE  </w:t>
-      </w:r>
-      <w:r>
-        <w:rPr>
-          <w:rFonts w:ascii="Noto Serif" w:hAnsi="Noto Serif"/>
-          <w:color w:val="26242A"/>
-          <w:sz w:val="20"/>
-        </w:rPr>
-        <w:t>Use the simplest maintainable design that preserves future provider swaps, memory evolution, UI redesign, and feature growth. Existing prototype class structure has no authority.</w:t>
+        <w:t>ARCHITECTURE  Use the simplest maintainable design that preserves future provider swaps, memory evolution, UI redesign, feature growth, backup/restore, and new context sources. Existing prototype class structure has no authority. Cross-cutting capabilities should be exposed through explicit provider-neutral contracts rather than patched directly into the chat loop.</w:t>
       </w:r>
     </w:p>
     <w:p>
@@ -1678,13 +1644,95 @@
     <w:p>
       <w:pPr/>
       <w:r>
-        <w:rPr>
-          <w:rFonts w:ascii="Aptos" w:hAnsi="Aptos"/>
-          <w:b/>
-          <w:color w:val="7E6884"/>
-          <w:sz w:val="17"/>
-        </w:rPr>
-        <w:t>PERSISTENCE FOUNDATION  Room schema v3 is current at 26 tables (identity hash 59982f69933deee14cc34323bba4c4cb). Schemas v1 and v2 remain preserved as historical migration baselines, with explicit non-destructive Migrations 1-&gt;2 and 2-&gt;3. Canonical memory write transactions v1, Conversation Timeline Foundation v1, Safe Delete v1, and Shai System Instructions Foundation v1 are implemented and integrated. Future physical-schema changes must use explicit migrations; destructive migration fallback is not permitted.</w:t>
+        <w:t>PERSISTENCE FOUNDATION  Room schema v3 is current at 26 tables (identity hash 59982f69933deee14cc34323bba4c4cb). Schemas v1 and v2 remain preserved as historical migration baselines, with explicit non-destructive Migrations 1-&gt;2 and 2-&gt;3. Canonical memory write transactions v1, Conversation Timeline Foundation v1, Safe Delete v1, and Shai System Instructions Foundation v1 are implemented and integrated. Future physical-schema changes must use explicit migrations; destructive migration fallback is not permitted. The remaining close-the-walls contracts below are now part of the required foundation even where their implementation follows in later commits.</w:t>
+      </w:r>
+    </w:p>
+    <w:p>
+      <w:pPr>
+        <w:pStyle w:val="Heading2"/>
+      </w:pPr>
+      <w:r>
+        <w:t>Close-the-walls foundation contracts</w:t>
+      </w:r>
+    </w:p>
+    <w:p>
+      <w:pPr>
+        <w:pStyle w:val="ListBullet"/>
+      </w:pPr>
+      <w:r>
+        <w:t>Generic attachment ownership: the persistence model must treat images as the first supported attachment kind, not as a one-off image-only feature. Attachment identity, MIME type, size, local storage reference, content hash, source, message association, ordering, creation time, and generation provenance must be representable so later file types can reuse the same foundation.</w:t>
+      </w:r>
+    </w:p>
+    <w:p>
+      <w:pPr>
+        <w:pStyle w:val="ListBullet"/>
+      </w:pPr>
+      <w:r>
+        <w:t>Context-source registry: future model context must be assembled from registered provider-neutral sources rather than direct feature-to-prompt wiring. Each source declares a semantic layer, bounded payload, freshness/lifetime, provenance/trust class, and budget behavior. Reading a context source must not mutate cognitive state.</w:t>
+      </w:r>
+    </w:p>
+    <w:p>
+      <w:pPr>
+        <w:pStyle w:val="ListBullet"/>
+      </w:pPr>
+      <w:r>
+        <w:t>Ephemeral app state is its own domain. Temporary operational facts such as ARCADE_STATE, active tool work, timers, navigation context, or other live app conditions are neither persistent truth nor Memory merely because Riven can see them. Only explicitly selected state should enter model context.</w:t>
+      </w:r>
+    </w:p>
+    <w:p>
+      <w:pPr>
+        <w:pStyle w:val="ListBullet"/>
+      </w:pPr>
+      <w:r>
+        <w:t>Secure provider configuration: secret material uses Android Keystore-backed storage. Provider profiles and model selections remain replaceable and capability-driven. Core conversation code must not depend on one provider brand or hard-coded capability assumptions.</w:t>
+      </w:r>
+    </w:p>
+    <w:p>
+      <w:pPr>
+        <w:pStyle w:val="ListBullet"/>
+      </w:pPr>
+      <w:r>
+        <w:t>Background work orchestration: WorkManager (or a deliberately equivalent Android lifecycle-safe abstraction if later justified) owns deferred app work such as memory extraction, derived-artifact repair, cleanup, maintenance, and scheduled local processing. Jobs must be idempotent, retry-aware, cancellable where meaningful, and safe across process death. The existing repair_jobs table remains durable work state rather than a substitute for Android execution scheduling.</w:t>
+      </w:r>
+    </w:p>
+    <w:p>
+      <w:pPr>
+        <w:pStyle w:val="ListBullet"/>
+      </w:pPr>
+      <w:r>
+        <w:t>Explicit memory intent: the domain layer must expose direct user-intent operations for Remember, Correct, Forget, and Delete. Natural-language interpretation and future UI controls may invoke these operations, but correctness must not depend on a model merely noticing imperative wording. Manual intent must use the same provenance, suppression, deletion, and audit rules as automatic memory workflows.</w:t>
+      </w:r>
+    </w:p>
+    <w:p>
+      <w:pPr>
+        <w:pStyle w:val="ListBullet"/>
+      </w:pPr>
+      <w:r>
+        <w:t>Backup / export / restore: Riven must support a versioned, user-triggered portable archive contract capable of representing the canonical database plus owned media. Export is never silent. Restore must validate archive version and integrity before import and must use normal migrations where needed. Secrets/credentials are excluded by default and must not be casually copied into exports.</w:t>
+      </w:r>
+    </w:p>
+    <w:p>
+      <w:pPr>
+        <w:pStyle w:val="ListBullet"/>
+      </w:pPr>
+      <w:r>
+        <w:t>Reset boundaries: Delete Conversation, Clear Conversations, Clear Memory, Clear Media, Reset Provider Settings, and Factory Reset are distinct product operations. They must compose the same dependency-aware deletion rules rather than bypassing them with raw table wipes. The eventual UI must describe scope before destructive confirmation.</w:t>
+      </w:r>
+    </w:p>
+    <w:p>
+      <w:pPr>
+        <w:pStyle w:val="ListBullet"/>
+      </w:pPr>
+      <w:r>
+        <w:t>Search/index discipline: local full-text search, semantic indexes, embeddings, previews, caches, and future search documents are derived surfaces, never independent evidence. They must be rebuildable and participate in correction, rewind exclusion, Forget, Safe Delete, transcript deletion, and restore verification.</w:t>
+      </w:r>
+    </w:p>
+    <w:p>
+      <w:pPr>
+        <w:pStyle w:val="ListBullet"/>
+      </w:pPr>
+      <w:r>
+        <w:t>Draft persistence: unsent text drafts should survive process death/relaunch per conversation without becoming Messages, Experiences, Memories, or provider requests until Shai actually sends them. Draft deletion is local editing state, not cognitive deletion.</w:t>
       </w:r>
     </w:p>
     <w:tbl>
@@ -1849,12 +1897,7 @@
         <w:spacing w:before="0" w:after="100" w:line="259" w:lineRule="auto"/>
       </w:pPr>
       <w:r>
-        <w:rPr>
-          <w:rFonts w:ascii="Noto Serif" w:hAnsi="Noto Serif"/>
-          <w:color w:val="26242A"/>
-          <w:sz w:val="20"/>
-        </w:rPr>
-        <w:t>Every model request should be assembled from bounded, relevant context rather than an endlessly growing transcript:</w:t>
+        <w:t>Every model request should be assembled from bounded, relevant context through the provider-neutral context-source registry rather than an endlessly growing transcript or direct feature-to-prompt wiring:</w:t>
       </w:r>
     </w:p>
     <w:p>
@@ -1975,6 +2018,12 @@
           <w:sz w:val="20"/>
         </w:rPr>
         <w:t>Riven state must remain composable. Do not represent him with one giant mood variable. Affection, energy, immediate emotion, current scene, relationship context, and negotiated power dynamic can coexist without overwriting one another.</w:t>
+      </w:r>
+    </w:p>
+    <w:p>
+      <w:pPr/>
+      <w:r>
+        <w:t>Context assembly must distinguish three categories: durable canonical state, ephemeral operational/app state, and cognitive Memory. A feature may expose bounded context without becoming Memory. Context sources must identify their semantic layer, freshness, and provenance, and stale or disabled sources must disappear from assembled context without rewriting history.</w:t>
       </w:r>
     </w:p>
     <w:tbl>
@@ -2133,7 +2182,7 @@
         <w:pStyle w:val="ListBullet"/>
       </w:pPr>
       <w:r>
-        <w:t>Shai can send images as first-class message attachments. Attachment identity, message association, ordering, and relaunch restoration must survive locally; a provider-neutral multimodal boundary decides how an active model receives them.</w:t>
+        <w:t>Shai can send images as the first supported kind of a generic first-class attachment model. Attachment ownership, message association, ordering, MIME/type metadata, content hash, local storage reference, relaunch restoration, and deletion provenance must survive locally; a provider-neutral multimodal boundary decides how an active model receives supported media. The architecture must not require a new persistence concept merely to support another file type later.</w:t>
       </w:r>
     </w:p>
     <w:p>
@@ -2141,7 +2190,7 @@
         <w:pStyle w:val="ListBullet"/>
       </w:pPr>
       <w:r>
-        <w:t>Riven can send generated selfie-style images as chat media when an image-generation capability is available. The Appearance Canon is the visual authority. Generated images are app/media artifacts, not proof of a physical camera event, and Riven must not claim camera access or real-world capture the app did not perform.</w:t>
+        <w:t>Riven can send generated selfie-style images as generated attachment/media records when an image-generation capability is available. Generation provenance must identify that the artifact was produced by the app/capability and what appearance authority/version governed it. The Appearance Canon is the visual authority. Generated images are app/media artifacts, not proof of a physical camera event, and Riven must not claim camera access or real-world capture the app did not perform.</w:t>
       </w:r>
     </w:p>
     <w:p>
@@ -3298,6 +3347,22 @@
     <w:p>
       <w:pPr>
         <w:pStyle w:val="ListBullet"/>
+      </w:pPr>
+      <w:r>
+        <w:t>Manual Remember / Correct / Forget / Delete intent must be available as explicit domain operations so direct user control does not depend on a model successfully inferring intent from prose. These operations share the same canonical transaction, provenance, audit, suppression, and deletion machinery as automatic memory workflows.</w:t>
+      </w:r>
+    </w:p>
+    <w:p>
+      <w:pPr>
+        <w:pStyle w:val="ListBullet"/>
+      </w:pPr>
+      <w:r>
+        <w:t>Search indexes, embeddings, summaries, caches, previews, and local full-text search are derived representations only. They cannot become independent evidence or preserve deleted/corrected/abandoned-branch content after canonical state changes.</w:t>
+      </w:r>
+    </w:p>
+    <w:p>
+      <w:pPr>
+        <w:pStyle w:val="ListBullet"/>
         <w:spacing w:after="60" w:line="252" w:lineRule="auto"/>
       </w:pPr>
       <w:r>
@@ -3643,6 +3708,62 @@
           <w:sz w:val="20"/>
         </w:rPr>
         <w:t>The app should preserve enough action history for Riven and Shai to understand what actually happened.</w:t>
+      </w:r>
+    </w:p>
+    <w:p>
+      <w:pPr>
+        <w:pStyle w:val="ListBullet"/>
+      </w:pPr>
+      <w:r>
+        <w:t>Long-running or deferred local work must use lifecycle-safe background execution with durable idempotent state. Riven may report a job as scheduled/running/completed/failed only from real stored execution state, never because a model predicted that background work probably succeeded.</w:t>
+      </w:r>
+    </w:p>
+    <w:p>
+      <w:pPr>
+        <w:pStyle w:val="Heading2"/>
+      </w:pPr>
+      <w:r>
+        <w:t>Backup, restore, reset, search, and drafts</w:t>
+      </w:r>
+    </w:p>
+    <w:p>
+      <w:pPr>
+        <w:pStyle w:val="ListBullet"/>
+      </w:pPr>
+      <w:r>
+        <w:t>Export / backup is deliberate and user-triggered. The archive format must be versioned and integrity-checkable and may include the canonical database plus app-owned attachments/media. Credentials and API secrets are excluded by default. No silent cloud backup of intimate content is assumed.</w:t>
+      </w:r>
+    </w:p>
+    <w:p>
+      <w:pPr>
+        <w:pStyle w:val="ListBullet"/>
+      </w:pPr>
+      <w:r>
+        <w:t>Restore validates archive format/version before import, preserves provenance, and runs normal database migrations as needed. A failed restore must not partially overwrite the active installation.</w:t>
+      </w:r>
+    </w:p>
+    <w:p>
+      <w:pPr>
+        <w:pStyle w:val="ListBullet"/>
+      </w:pPr>
+      <w:r>
+        <w:t>Destructive reset scopes are distinct: Delete Conversation; Clear Conversations; Clear Memory; Clear Media; Reset Provider Settings; Factory Reset. Each operation must state what survives and must use dependency-aware deletion rather than raw table erasure where canonical provenance exists.</w:t>
+      </w:r>
+    </w:p>
+    <w:p>
+      <w:pPr>
+        <w:pStyle w:val="ListBullet"/>
+      </w:pPr>
+      <w:r>
+        <w:t>Local conversation/memory/media search is permitted only as a rebuildable derived layer. Search results must respect active timeline state, correction, forgetting, deletion, sensitive visibility, and source provenance.</w:t>
+      </w:r>
+    </w:p>
+    <w:p>
+      <w:pPr>
+        <w:pStyle w:val="ListBullet"/>
+      </w:pPr>
+      <w:r>
+        <w:t>Per-conversation unsent drafts survive relaunch but remain editing state only. A draft becomes canonical transcript history only when it is sent and persisted as a Message.</w:t>
       </w:r>
     </w:p>
     <w:tbl>
@@ -4101,6 +4222,14 @@
     <w:p>
       <w:pPr>
         <w:pStyle w:val="ListBullet"/>
+      </w:pPr>
+      <w:r>
+        <w:t>User-triggered export/backup is the exception: it must be explicit, versioned, integrity-checkable, and clear about included data. Secrets are excluded by default. Restore must not silently merge incompatible or corrupt archives into canonical state.</w:t>
+      </w:r>
+    </w:p>
+    <w:p>
+      <w:pPr>
+        <w:pStyle w:val="ListBullet"/>
         <w:spacing w:after="60" w:line="252" w:lineRule="auto"/>
       </w:pPr>
       <w:r>
@@ -4332,12 +4461,7 @@
         <w:spacing w:after="60" w:line="252" w:lineRule="auto"/>
       </w:pPr>
       <w:r>
-        <w:rPr>
-          <w:rFonts w:ascii="Noto Serif" w:hAnsi="Noto Serif"/>
-          <w:color w:val="26242A"/>
-          <w:sz w:val="20"/>
-        </w:rPr>
-        <w:t>Dependency injection, module boundaries, secure credential implementation, backup policy, and notification internals remain open where not already locked by the foundation decisions.</w:t>
+        <w:t>Dependency injection, internal module boundaries, exact encrypted-export container format, provider-profile UI, and notification internals remain open where not already locked by the foundation contracts. Secure credential posture, backup/export semantics, reset boundaries, context-source behavior, background-work requirements, and draft semantics are now locked at the contract level.</w:t>
       </w:r>
     </w:p>
     <w:tbl>
@@ -4467,13 +4591,7 @@
         <w:spacing w:before="60" w:after="40"/>
       </w:pPr>
       <w:r>
-        <w:rPr>
-          <w:rFonts w:ascii="Noto Sans" w:hAnsi="Noto Sans"/>
-          <w:b/>
-          <w:color w:val="7E6884"/>
-          <w:sz w:val="20"/>
-        </w:rPr>
-        <w:t>2. Define platform foundation - CORE STACK / PERSISTENCE / TIMELINE / SAFE DELETE / SYSTEM INSTRUCTIONS COMPLETE</w:t>
+        <w:t>2. Define platform foundation - CORE STACK / PERSISTENCE / TIMELINE / SAFE DELETE / SYSTEM INSTRUCTIONS COMPLETE; CLOSE-THE-WALLS CONTRACTS LOCKED</w:t>
       </w:r>
     </w:p>
     <w:p>
@@ -4482,23 +4600,13 @@
         <w:ind w:left="259"/>
       </w:pPr>
       <w:r>
-        <w:rPr>
-          <w:rFonts w:ascii="Noto Serif" w:hAnsi="Noto Serif"/>
-          <w:color w:val="26242A"/>
-          <w:sz w:val="19"/>
-        </w:rPr>
-        <w:t>Kotlin, Jetpack Compose, Room/SQLite, Java 17, minSdk 35, and API 37 are locked for the foundation. Room schema v3 (26 tables), explicit Migrations 1-&gt;2-&gt;3, canonical memory write transactions v1, Conversation Timeline Foundation v1, Safe Delete v1, and Shai System Instructions Foundation v1 are complete. Secure credential implementation, lifecycle details, and backup/privacy policy remain follow-up foundation work.</w:t>
+        <w:t>Kotlin, Jetpack Compose, Room/SQLite, Java 17, minSdk 35, and API 37 are locked for the foundation. Room schema v3 (26 tables), explicit Migrations 1-&gt;2-&gt;3, canonical memory write transactions v1, Conversation Timeline Foundation v1, Safe Delete v1, and Shai System Instructions Foundation v1 are complete. The contracts for generic attachments, context-source registry / ephemeral app state, secure provider configuration, WorkManager-style background execution, explicit memory intent, versioned export/restore, reset scopes, derived search/index behavior, and draft persistence are now locked before the walls close.</w:t>
       </w:r>
     </w:p>
     <w:p>
       <w:pPr/>
       <w:r>
-        <w:rPr>
-          <w:rFonts w:ascii="Aptos" w:hAnsi="Aptos"/>
-          <w:b/>
-          <w:color w:val="7E6884"/>
-        </w:rPr>
-        <w:t>3. Complete chat/context provenance foundation - DELETE + SYSTEM INSTRUCTIONS COMPLETE / MEDIA NEXT</w:t>
+        <w:t>3. Complete close-the-walls plumbing - NEXT</w:t>
       </w:r>
     </w:p>
     <w:p>
@@ -4507,7 +4615,7 @@
         <w:ind w:left="259"/>
       </w:pPr>
       <w:r>
-        <w:t>Rewind, regenerate, active/inactive branch semantics, stale-write protection, safe transcript Delete propagation, and persistent Shai-authored System Instructions are implemented. Next implement first-class image/selfie attachment storage and media provenance before automatic candidate extraction begins.</w:t>
+        <w:t>Implement the remaining cross-cutting plumbing in small isolated slices before automatic extraction/provider wiring: generic attachment/media ownership and generated-media provenance; context-source registry plus ephemeral app-state contract; secure provider-profile/credential storage; lifecycle-safe background-work execution; explicit manual memory-intent entry points; backup/export/restore and reset contracts in code; and relaunch-safe draft persistence. Local search remains a documented derived-surface obligation and may be implemented when search UI arrives.</w:t>
       </w:r>
     </w:p>
     <w:p>
@@ -4515,13 +4623,7 @@
         <w:spacing w:before="60" w:after="40"/>
       </w:pPr>
       <w:r>
-        <w:rPr>
-          <w:rFonts w:ascii="Noto Sans" w:hAnsi="Noto Sans"/>
-          <w:b/>
-          <w:color w:val="7E6884"/>
-          <w:sz w:val="20"/>
-        </w:rPr>
-        <w:t>4. Build durable local chat - CORE TRANSCRIPT CONTROLS COMPLETE</w:t>
+        <w:t>4. Build durable local chat - CORE TRANSCRIPT CONTROLS COMPLETE / ATTACHMENTS + DRAFTS REMAIN</w:t>
       </w:r>
     </w:p>
     <w:p>
@@ -4530,12 +4632,7 @@
         <w:ind w:left="259"/>
       </w:pPr>
       <w:r>
-        <w:rPr>
-          <w:rFonts w:ascii="Noto Serif" w:hAnsi="Noto Serif"/>
-          <w:color w:val="26242A"/>
-          <w:sz w:val="19"/>
-        </w:rPr>
-        <w:t>Message persistence, immutable creation ordering, active-path reconstruction, rewind, regeneration, safe deletion, relaunch-safe migrations, and System Instructions persistence are implemented. Remaining durable-chat work includes attachments, provider request/error/retry/cancellation integration, and restoration of associated media/context state.</w:t>
+        <w:t>Message persistence, immutable creation ordering, active-path reconstruction, rewind, regeneration, safe deletion, relaunch-safe migrations, and System Instructions persistence are implemented. Remaining durable-chat work is generic attachment storage, generated-media provenance, per-conversation drafts, provider request/error/retry/cancellation integration, and restoration of associated media/context state.</w:t>
       </w:r>
     </w:p>
     <w:p>
@@ -4543,12 +4640,6 @@
         <w:spacing w:before="60" w:after="40"/>
       </w:pPr>
       <w:r>
-        <w:rPr>
-          <w:rFonts w:ascii="Noto Sans" w:hAnsi="Noto Sans"/>
-          <w:b/>
-          <w:color w:val="7E6884"/>
-          <w:sz w:val="20"/>
-        </w:rPr>
         <w:t>5. Add provider-neutral conversation engine</w:t>
       </w:r>
     </w:p>
@@ -4558,12 +4649,7 @@
         <w:ind w:left="259"/>
       </w:pPr>
       <w:r>
-        <w:rPr>
-          <w:rFonts w:ascii="Noto Serif" w:hAnsi="Noto Serif"/>
-          <w:color w:val="26242A"/>
-          <w:sz w:val="19"/>
-        </w:rPr>
-        <w:t>Implement one provider behind a replaceable interface and assemble bounded context from canon, Shai-authored System Instructions, state, active recent chat, memory, knowledge, attachments, and real tool results.</w:t>
+        <w:t>Implement one provider behind a replaceable capability-based interface and assemble bounded context through the context-source registry from app invariants, canon, Shai-authored System Instructions, state, active recent chat, memory, knowledge, attachments, ephemeral app state, and real tool results. Secrets remain behind secure storage and provider capability differences must not leak into canonical conversation records.</w:t>
       </w:r>
     </w:p>
     <w:p>
@@ -4571,13 +4657,7 @@
         <w:spacing w:before="60" w:after="40"/>
       </w:pPr>
       <w:r>
-        <w:rPr>
-          <w:rFonts w:ascii="Noto Sans" w:hAnsi="Noto Sans"/>
-          <w:b/>
-          <w:color w:val="7E6884"/>
-          <w:sz w:val="20"/>
-        </w:rPr>
-        <w:t>6. Implement memory v1 - PERSISTENCE / WRITE / DELETE LAYERS COMPLETE</w:t>
+        <w:t>6. Implement memory v1 - PERSISTENCE / WRITE / DELETE LAYERS COMPLETE; EXTRACTION WAITS FOR CLOSE-THE-WALLS PLUMBING</w:t>
       </w:r>
     </w:p>
     <w:p>
@@ -4586,12 +4666,7 @@
         <w:ind w:left="259"/>
       </w:pPr>
       <w:r>
-        <w:rPr>
-          <w:rFonts w:ascii="Noto Serif" w:hAnsi="Noto Serif"/>
-          <w:color w:val="26242A"/>
-          <w:sz w:val="19"/>
-        </w:rPr>
-        <w:t>Canonical memory storage, write transactions, and safe deletion are complete on schema v3. Candidate extraction, validation, and retrieval wait until attachment/media provenance is implemented, so only authoritative active history and first-class media sources can become cognitive evidence.</w:t>
+        <w:t>Canonical memory storage, write transactions, and safe deletion are complete on schema v3. Candidate extraction, validation, and retrieval wait until attachment/media provenance, active context-source boundaries, and explicit manual-memory intent hooks are in place, so only authoritative active history and first-class grounded sources can become cognitive evidence.</w:t>
       </w:r>
     </w:p>
     <w:p>
@@ -5103,6 +5178,62 @@
         <w:pStyle w:val="ListBullet"/>
       </w:pPr>
       <w:r>
+        <w:t>A stale or disabled context source cannot leak old state into a new model request; ephemeral app state is visible only when explicitly exposed and never becomes Memory merely by entering context.</w:t>
+      </w:r>
+    </w:p>
+    <w:p>
+      <w:pPr>
+        <w:pStyle w:val="ListBullet"/>
+      </w:pPr>
+      <w:r>
+        <w:t>API credentials and service secrets never appear in Room, ordinary preferences, export archives by default, transcript records, screenshots, or routine logs.</w:t>
+      </w:r>
+    </w:p>
+    <w:p>
+      <w:pPr>
+        <w:pStyle w:val="ListBullet"/>
+      </w:pPr>
+      <w:r>
+        <w:t>A versioned export can be validated before restore; a failed or incompatible restore cannot partially overwrite canonical database/media state.</w:t>
+      </w:r>
+    </w:p>
+    <w:p>
+      <w:pPr>
+        <w:pStyle w:val="ListBullet"/>
+      </w:pPr>
+      <w:r>
+        <w:t>Deleting or resetting one data scope does not silently erase unrelated scopes, while Factory Reset removes all app-owned canonical data according to its explicit contract.</w:t>
+      </w:r>
+    </w:p>
+    <w:p>
+      <w:pPr>
+        <w:pStyle w:val="ListBullet"/>
+      </w:pPr>
+      <w:r>
+        <w:t>Unsent drafts survive relaunch but never appear as Messages, Experiences, provider requests, or Memory evidence until sent.</w:t>
+      </w:r>
+    </w:p>
+    <w:p>
+      <w:pPr>
+        <w:pStyle w:val="ListBullet"/>
+      </w:pPr>
+      <w:r>
+        <w:t>Derived local search/index state is rebuildable and cannot resurrect corrected, forgotten, deleted, or abandoned-branch content.</w:t>
+      </w:r>
+    </w:p>
+    <w:p>
+      <w:pPr>
+        <w:pStyle w:val="ListBullet"/>
+      </w:pPr>
+      <w:r>
+        <w:t>Background jobs survive process death safely, are idempotent across retry, and cannot be reported as completed unless durable execution state confirms completion.</w:t>
+      </w:r>
+    </w:p>
+    <w:p>
+      <w:pPr>
+        <w:pStyle w:val="ListBullet"/>
+      </w:pPr>
+      <w:r>
         <w:t>Image messages restore with the transcript after relaunch, and Riven selfie-style generation follows the Appearance Canon without falsely implying camera access.</w:t>
       </w:r>
     </w:p>
@@ -5375,7 +5506,7 @@
         <w:pStyle w:val="ListBullet"/>
       </w:pPr>
       <w:r>
-        <w:t>Conversation Interaction Implementation Record - Conversation Timeline Foundation v1, Safe Delete v1, and Shai System Instructions Foundation v1 are implemented. Remaining pre-extraction work: first-class image attachments, selfie/media message storage, and media provenance/context wiring.</w:t>
+        <w:t>Conversation Interaction Implementation Record - Conversation Timeline Foundation v1, Safe Delete v1, and Shai System Instructions Foundation v1 are implemented. Remaining pre-extraction chat work: generic attachment/media storage, generated-media provenance/context wiring, and draft persistence.</w:t>
       </w:r>
     </w:p>
     <w:p>
@@ -5384,12 +5515,39 @@
         <w:spacing w:after="60" w:line="252" w:lineRule="auto"/>
       </w:pPr>
       <w:r>
-        <w:rPr>
-          <w:rFonts w:ascii="Noto Serif" w:hAnsi="Noto Serif"/>
-          <w:color w:val="26242A"/>
-          <w:sz w:val="20"/>
-        </w:rPr>
-        <w:t>Platform Foundation Decision Record - follow-up for secure credential storage, app lifecycle strategy, backup/privacy behavior, and other unresolved foundation details; the core Android stack and Room schema v3 persistence are already locked.</w:t>
+        <w:t>Platform Foundation Decision Record - close-the-walls contracts are now locked for secure credential/provider profiles, context-source registry and ephemeral app state, lifecycle-safe background work, explicit manual memory intent, versioned backup/export/restore, reset scopes, derived search/index behavior, and draft persistence. Implementation records should be added as each slice lands.</w:t>
+      </w:r>
+    </w:p>
+    <w:p>
+      <w:pPr>
+        <w:pStyle w:val="ListBullet"/>
+      </w:pPr>
+      <w:r>
+        <w:t>Data Portability &amp; Reset Spec - concrete archive manifest/encryption choices, restore conflict handling, media inclusion rules, credential exclusion/re-entry flow, and destructive-scope UX.</w:t>
+      </w:r>
+    </w:p>
+    <w:p>
+      <w:pPr>
+        <w:pStyle w:val="ListBullet"/>
+      </w:pPr>
+      <w:r>
+        <w:t>Context Source Registry Spec - semantic layers, source identity, freshness/expiry, provenance/trust, token budget behavior, and ephemeral-state admission rules.</w:t>
+      </w:r>
+    </w:p>
+    <w:p>
+      <w:pPr>
+        <w:pStyle w:val="ListBullet"/>
+      </w:pPr>
+      <w:r>
+        <w:t>Provider Profile &amp; Capability Spec - secure secret storage, non-secret profile metadata, model capability discovery, provider/model selection, and failure/fallback semantics.</w:t>
+      </w:r>
+    </w:p>
+    <w:p>
+      <w:pPr>
+        <w:pStyle w:val="ListBullet"/>
+      </w:pPr>
+      <w:r>
+        <w:t>Background Work Spec - WorkManager job classes, durable repair-job handoff, idempotency keys, retries/backoff, cancellation, process-death recovery, and truthful user-visible state.</w:t>
       </w:r>
     </w:p>
     <w:p>

</xml_diff>